<commit_message>
added backgroundstudy and gap analysis
</commit_message>
<xml_diff>
--- a/documents/phase 1/Phase-I Progress Report student dropout.docx
+++ b/documents/phase 1/Phase-I Progress Report student dropout.docx
@@ -1489,7 +1489,7 @@
                 </w:pPr>
                 <w:r>
                   <w:rPr>
-                    <w:rFonts w:ascii="MS Gothic" w:eastAsia="MS Gothic" w:hAnsi="MS Gothic" w:cs="Times New Roman" w:hint="eastAsia"/>
+                    <w:rFonts w:ascii="Arial Unicode MS" w:hAnsi="Arial Unicode MS" w:cs="Times New Roman"/>
                   </w:rPr>
                   <w:t>☐</w:t>
                 </w:r>
@@ -3264,7 +3264,6 @@
           <w:sz w:val="28"/>
           <w:szCs w:val="28"/>
         </w:rPr>
-        <w:lastRenderedPageBreak/>
         <w:t>Project Overview</w:t>
       </w:r>
     </w:p>
@@ -3322,7 +3321,75 @@
           <w:sz w:val="24"/>
           <w:szCs w:val="24"/>
         </w:rPr>
-        <w:t>This research addresses a critical flaw in current dropout prediction systems: they predict but do not explain. Universities receive at-risk lists without understanding whether problems stem from attendance, academics, or finances. Without explanations, interventions become guesswork. This project combines LSTM for temporal modeling with SHAP for interpretability, creating a transparent system that tracks evolving risk while explaining each prediction. Pre-admission data enables earlier identification, and threshold analysis reveals when intervention becomes critical.</w:t>
+        <w:t xml:space="preserve">This research addresses a critical flaw in current dropout prediction systems: they predict but do not explain. Universities receive at-risk lists without understanding </w:t>
+      </w:r>
+      <w:proofErr w:type="gramStart"/>
+      <w:r>
+        <w:rPr>
+          <w:rFonts w:ascii="Times New Roman" w:hAnsi="Times New Roman" w:cs="Times New Roman"/>
+          <w:sz w:val="24"/>
+          <w:szCs w:val="24"/>
+        </w:rPr>
+        <w:t xml:space="preserve">whether </w:t>
+      </w:r>
+      <w:r>
+        <w:rPr>
+          <w:rFonts w:ascii="Times New Roman" w:hAnsi="Times New Roman" w:cs="Times New Roman"/>
+          <w:sz w:val="24"/>
+          <w:szCs w:val="24"/>
+        </w:rPr>
+        <w:t xml:space="preserve"> </w:t>
+      </w:r>
+      <w:r>
+        <w:rPr>
+          <w:rFonts w:ascii="Times New Roman" w:hAnsi="Times New Roman" w:cs="Times New Roman"/>
+          <w:sz w:val="24"/>
+          <w:szCs w:val="24"/>
+        </w:rPr>
+        <w:t>problems</w:t>
+      </w:r>
+      <w:proofErr w:type="gramEnd"/>
+      <w:r>
+        <w:rPr>
+          <w:rFonts w:ascii="Times New Roman" w:hAnsi="Times New Roman" w:cs="Times New Roman"/>
+          <w:sz w:val="24"/>
+          <w:szCs w:val="24"/>
+        </w:rPr>
+        <w:t xml:space="preserve"> stem from attendance, academics, or finances. Without explanations, interventions become guesswork. This project combines LSTM for temporal </w:t>
+      </w:r>
+      <w:proofErr w:type="gramStart"/>
+      <w:r>
+        <w:rPr>
+          <w:rFonts w:ascii="Times New Roman" w:hAnsi="Times New Roman" w:cs="Times New Roman"/>
+          <w:sz w:val="24"/>
+          <w:szCs w:val="24"/>
+        </w:rPr>
+        <w:t xml:space="preserve">modeling </w:t>
+      </w:r>
+      <w:r>
+        <w:rPr>
+          <w:rFonts w:ascii="Times New Roman" w:hAnsi="Times New Roman" w:cs="Times New Roman"/>
+          <w:sz w:val="24"/>
+          <w:szCs w:val="24"/>
+        </w:rPr>
+        <w:t xml:space="preserve"> </w:t>
+      </w:r>
+      <w:r>
+        <w:rPr>
+          <w:rFonts w:ascii="Times New Roman" w:hAnsi="Times New Roman" w:cs="Times New Roman"/>
+          <w:sz w:val="24"/>
+          <w:szCs w:val="24"/>
+        </w:rPr>
+        <w:t>with</w:t>
+      </w:r>
+      <w:proofErr w:type="gramEnd"/>
+      <w:r>
+        <w:rPr>
+          <w:rFonts w:ascii="Times New Roman" w:hAnsi="Times New Roman" w:cs="Times New Roman"/>
+          <w:sz w:val="24"/>
+          <w:szCs w:val="24"/>
+        </w:rPr>
+        <w:t xml:space="preserve"> SHAP for interpretability, creating a transparent system that tracks evolving risk while explaining each prediction. Pre-admission data enables earlier identification, and threshold analysis reveals when intervention becomes critical.</w:t>
       </w:r>
     </w:p>
     <w:p>
@@ -3376,7 +3443,452 @@
           <w:sz w:val="24"/>
           <w:szCs w:val="24"/>
         </w:rPr>
-        <w:t>Summarize the relevant background information and literature that supports your project.</w:t>
+        <w:t xml:space="preserve">Student dropout prediction has increasingly utilized statistical analysis, machine learning, and data analytics; however, most </w:t>
+      </w:r>
+      <w:proofErr w:type="gramStart"/>
+      <w:r>
+        <w:rPr>
+          <w:rFonts w:ascii="Times New Roman" w:hAnsi="Times New Roman" w:cs="Times New Roman"/>
+          <w:sz w:val="24"/>
+          <w:szCs w:val="24"/>
+        </w:rPr>
+        <w:t xml:space="preserve">existing </w:t>
+      </w:r>
+      <w:r>
+        <w:rPr>
+          <w:rFonts w:ascii="Times New Roman" w:hAnsi="Times New Roman" w:cs="Times New Roman"/>
+          <w:sz w:val="24"/>
+          <w:szCs w:val="24"/>
+        </w:rPr>
+        <w:t xml:space="preserve"> </w:t>
+      </w:r>
+      <w:r>
+        <w:rPr>
+          <w:rFonts w:ascii="Times New Roman" w:hAnsi="Times New Roman" w:cs="Times New Roman"/>
+          <w:sz w:val="24"/>
+          <w:szCs w:val="24"/>
+        </w:rPr>
+        <w:t>works</w:t>
+      </w:r>
+      <w:proofErr w:type="gramEnd"/>
+      <w:r>
+        <w:rPr>
+          <w:rFonts w:ascii="Times New Roman" w:hAnsi="Times New Roman" w:cs="Times New Roman"/>
+          <w:sz w:val="24"/>
+          <w:szCs w:val="24"/>
+        </w:rPr>
+        <w:t xml:space="preserve"> struggle to balance temporal pattern recognition with model transparency. Early studies utilized regression models and ROC AUC analysis to forecast student dropout based on registration and demographic </w:t>
+      </w:r>
+      <w:proofErr w:type="gramStart"/>
+      <w:r>
+        <w:rPr>
+          <w:rFonts w:ascii="Times New Roman" w:hAnsi="Times New Roman" w:cs="Times New Roman"/>
+          <w:sz w:val="24"/>
+          <w:szCs w:val="24"/>
+        </w:rPr>
+        <w:t>data</w:t>
+      </w:r>
+      <w:r>
+        <w:rPr>
+          <w:rFonts w:ascii="Times New Roman" w:hAnsi="Times New Roman" w:cs="Times New Roman"/>
+          <w:sz w:val="24"/>
+          <w:szCs w:val="24"/>
+        </w:rPr>
+        <w:t xml:space="preserve"> </w:t>
+      </w:r>
+      <w:r>
+        <w:rPr>
+          <w:rFonts w:ascii="Times New Roman" w:hAnsi="Times New Roman" w:cs="Times New Roman"/>
+          <w:sz w:val="24"/>
+          <w:szCs w:val="24"/>
+        </w:rPr>
+        <w:t xml:space="preserve"> [</w:t>
+      </w:r>
+      <w:proofErr w:type="gramEnd"/>
+      <w:r>
+        <w:rPr>
+          <w:rFonts w:ascii="Times New Roman" w:hAnsi="Times New Roman" w:cs="Times New Roman"/>
+          <w:sz w:val="24"/>
+          <w:szCs w:val="24"/>
+        </w:rPr>
+        <w:t xml:space="preserve">2]. Other statistical approaches have heavily emphasized sociodemographic and financial variables. For instance, event </w:t>
+      </w:r>
+      <w:proofErr w:type="gramStart"/>
+      <w:r>
+        <w:rPr>
+          <w:rFonts w:ascii="Times New Roman" w:hAnsi="Times New Roman" w:cs="Times New Roman"/>
+          <w:sz w:val="24"/>
+          <w:szCs w:val="24"/>
+        </w:rPr>
+        <w:t>history</w:t>
+      </w:r>
+      <w:r>
+        <w:rPr>
+          <w:rFonts w:ascii="Times New Roman" w:hAnsi="Times New Roman" w:cs="Times New Roman"/>
+          <w:sz w:val="24"/>
+          <w:szCs w:val="24"/>
+        </w:rPr>
+        <w:t xml:space="preserve"> </w:t>
+      </w:r>
+      <w:r>
+        <w:rPr>
+          <w:rFonts w:ascii="Times New Roman" w:hAnsi="Times New Roman" w:cs="Times New Roman"/>
+          <w:sz w:val="24"/>
+          <w:szCs w:val="24"/>
+        </w:rPr>
+        <w:t xml:space="preserve"> analysis</w:t>
+      </w:r>
+      <w:proofErr w:type="gramEnd"/>
+      <w:r>
+        <w:rPr>
+          <w:rFonts w:ascii="Times New Roman" w:hAnsi="Times New Roman" w:cs="Times New Roman"/>
+          <w:sz w:val="24"/>
+          <w:szCs w:val="24"/>
+        </w:rPr>
+        <w:t xml:space="preserve"> and multinomial logit models have been extensively applied to identify that minority status, lower-income, and being a first-</w:t>
+      </w:r>
+      <w:proofErr w:type="gramStart"/>
+      <w:r>
+        <w:rPr>
+          <w:rFonts w:ascii="Times New Roman" w:hAnsi="Times New Roman" w:cs="Times New Roman"/>
+          <w:sz w:val="24"/>
+          <w:szCs w:val="24"/>
+        </w:rPr>
+        <w:t>generation</w:t>
+      </w:r>
+      <w:r>
+        <w:rPr>
+          <w:rFonts w:ascii="Times New Roman" w:hAnsi="Times New Roman" w:cs="Times New Roman"/>
+          <w:sz w:val="24"/>
+          <w:szCs w:val="24"/>
+        </w:rPr>
+        <w:t xml:space="preserve"> </w:t>
+      </w:r>
+      <w:r>
+        <w:rPr>
+          <w:rFonts w:ascii="Times New Roman" w:hAnsi="Times New Roman" w:cs="Times New Roman"/>
+          <w:sz w:val="24"/>
+          <w:szCs w:val="24"/>
+        </w:rPr>
+        <w:t xml:space="preserve"> student</w:t>
+      </w:r>
+      <w:proofErr w:type="gramEnd"/>
+      <w:r>
+        <w:rPr>
+          <w:rFonts w:ascii="Times New Roman" w:hAnsi="Times New Roman" w:cs="Times New Roman"/>
+          <w:sz w:val="24"/>
+          <w:szCs w:val="24"/>
+        </w:rPr>
+        <w:t xml:space="preserve"> significantly increase dropout risks, while high GPA and strong motivation lead to timely graduation [14], [15], [16], [17]. While these statistical methods provide excellent population-level insights into financial and racial factors, they lack the individualized, dynamic predictive capability of modern machine learning.</w:t>
+      </w:r>
+    </w:p>
+    <w:p>
+      <w:pPr>
+        <w:rPr>
+          <w:rFonts w:ascii="Times New Roman" w:hAnsi="Times New Roman" w:cs="Times New Roman"/>
+          <w:sz w:val="24"/>
+          <w:szCs w:val="24"/>
+        </w:rPr>
+      </w:pPr>
+      <w:r>
+        <w:rPr>
+          <w:rFonts w:ascii="Times New Roman" w:hAnsi="Times New Roman" w:cs="Times New Roman"/>
+          <w:sz w:val="24"/>
+          <w:szCs w:val="24"/>
+        </w:rPr>
+        <w:t xml:space="preserve">Moving towards machine learning, previous research explored the early prediction of student dropout using standard algorithms like Random Forest and Decision Trees [8]. Large-scale </w:t>
+      </w:r>
+      <w:proofErr w:type="gramStart"/>
+      <w:r>
+        <w:rPr>
+          <w:rFonts w:ascii="Times New Roman" w:hAnsi="Times New Roman" w:cs="Times New Roman"/>
+          <w:sz w:val="24"/>
+          <w:szCs w:val="24"/>
+        </w:rPr>
+        <w:t>predictive</w:t>
+      </w:r>
+      <w:r>
+        <w:rPr>
+          <w:rFonts w:ascii="Times New Roman" w:hAnsi="Times New Roman" w:cs="Times New Roman"/>
+          <w:sz w:val="24"/>
+          <w:szCs w:val="24"/>
+        </w:rPr>
+        <w:t xml:space="preserve"> </w:t>
+      </w:r>
+      <w:r>
+        <w:rPr>
+          <w:rFonts w:ascii="Times New Roman" w:hAnsi="Times New Roman" w:cs="Times New Roman"/>
+          <w:sz w:val="24"/>
+          <w:szCs w:val="24"/>
+        </w:rPr>
+        <w:t xml:space="preserve"> modeling</w:t>
+      </w:r>
+      <w:proofErr w:type="gramEnd"/>
+      <w:r>
+        <w:rPr>
+          <w:rFonts w:ascii="Times New Roman" w:hAnsi="Times New Roman" w:cs="Times New Roman"/>
+          <w:sz w:val="24"/>
+          <w:szCs w:val="24"/>
+        </w:rPr>
+        <w:t xml:space="preserve"> has also been conducted using diverse global datasets. For example, traditional classifiers like Random Forest, Elastic Net, and </w:t>
+      </w:r>
+      <w:proofErr w:type="spellStart"/>
+      <w:r>
+        <w:rPr>
+          <w:rFonts w:ascii="Times New Roman" w:hAnsi="Times New Roman" w:cs="Times New Roman"/>
+          <w:sz w:val="24"/>
+          <w:szCs w:val="24"/>
+        </w:rPr>
+        <w:t>CatBoost</w:t>
+      </w:r>
+      <w:proofErr w:type="spellEnd"/>
+      <w:r>
+        <w:rPr>
+          <w:rFonts w:ascii="Times New Roman" w:hAnsi="Times New Roman" w:cs="Times New Roman"/>
+          <w:sz w:val="24"/>
+          <w:szCs w:val="24"/>
+        </w:rPr>
+        <w:t xml:space="preserve"> have been utilized across various cohorts—from 50,095 students in the US [11] to university students in Hungary [12] and South Korea [13]. These models successfully predicted dropouts achieving </w:t>
+      </w:r>
+      <w:proofErr w:type="gramStart"/>
+      <w:r>
+        <w:rPr>
+          <w:rFonts w:ascii="Times New Roman" w:hAnsi="Times New Roman" w:cs="Times New Roman"/>
+          <w:sz w:val="24"/>
+          <w:szCs w:val="24"/>
+        </w:rPr>
+        <w:t>precisions</w:t>
+      </w:r>
+      <w:r>
+        <w:rPr>
+          <w:rFonts w:ascii="Times New Roman" w:hAnsi="Times New Roman" w:cs="Times New Roman"/>
+          <w:sz w:val="24"/>
+          <w:szCs w:val="24"/>
+        </w:rPr>
+        <w:t xml:space="preserve"> </w:t>
+      </w:r>
+      <w:r>
+        <w:rPr>
+          <w:rFonts w:ascii="Times New Roman" w:hAnsi="Times New Roman" w:cs="Times New Roman"/>
+          <w:sz w:val="24"/>
+          <w:szCs w:val="24"/>
+        </w:rPr>
+        <w:t xml:space="preserve"> up</w:t>
+      </w:r>
+      <w:proofErr w:type="gramEnd"/>
+      <w:r>
+        <w:rPr>
+          <w:rFonts w:ascii="Times New Roman" w:hAnsi="Times New Roman" w:cs="Times New Roman"/>
+          <w:sz w:val="24"/>
+          <w:szCs w:val="24"/>
+        </w:rPr>
+        <w:t xml:space="preserve"> to 83% by highlighting static features such as high school GPA, behavioral metrics (e.g., campus event attendance), and tuition fees. </w:t>
+      </w:r>
+      <w:proofErr w:type="gramStart"/>
+      <w:r>
+        <w:rPr>
+          <w:rFonts w:ascii="Times New Roman" w:hAnsi="Times New Roman" w:cs="Times New Roman"/>
+          <w:sz w:val="24"/>
+          <w:szCs w:val="24"/>
+        </w:rPr>
+        <w:t xml:space="preserve">However, </w:t>
+      </w:r>
+      <w:r>
+        <w:rPr>
+          <w:rFonts w:ascii="Times New Roman" w:hAnsi="Times New Roman" w:cs="Times New Roman"/>
+          <w:sz w:val="24"/>
+          <w:szCs w:val="24"/>
+        </w:rPr>
+        <w:t xml:space="preserve"> </w:t>
+      </w:r>
+      <w:r>
+        <w:rPr>
+          <w:rFonts w:ascii="Times New Roman" w:hAnsi="Times New Roman" w:cs="Times New Roman"/>
+          <w:sz w:val="24"/>
+          <w:szCs w:val="24"/>
+        </w:rPr>
+        <w:t>a</w:t>
+      </w:r>
+      <w:proofErr w:type="gramEnd"/>
+      <w:r>
+        <w:rPr>
+          <w:rFonts w:ascii="Times New Roman" w:hAnsi="Times New Roman" w:cs="Times New Roman"/>
+          <w:sz w:val="24"/>
+          <w:szCs w:val="24"/>
+        </w:rPr>
+        <w:t xml:space="preserve"> major limitation of these studies is their reliance on static, single-snapshot data, failing to capture the temporal changes in student behavior over successive semesters. Other researchers focused on specific platforms, predicting dropouts using Moodle activity trends [7] or regional </w:t>
+      </w:r>
+      <w:proofErr w:type="spellStart"/>
+      <w:r>
+        <w:rPr>
+          <w:rFonts w:ascii="Times New Roman" w:hAnsi="Times New Roman" w:cs="Times New Roman"/>
+          <w:sz w:val="24"/>
+          <w:szCs w:val="24"/>
+        </w:rPr>
+        <w:t>Uwezo</w:t>
+      </w:r>
+      <w:proofErr w:type="spellEnd"/>
+      <w:r>
+        <w:rPr>
+          <w:rFonts w:ascii="Times New Roman" w:hAnsi="Times New Roman" w:cs="Times New Roman"/>
+          <w:sz w:val="24"/>
+          <w:szCs w:val="24"/>
+        </w:rPr>
+        <w:t xml:space="preserve"> datasets in developing countries [4], which often lack a holistic view of a student's risk profile or the integration of sequential algorithms.</w:t>
+      </w:r>
+    </w:p>
+    <w:p>
+      <w:pPr>
+        <w:rPr>
+          <w:rFonts w:ascii="Times New Roman" w:hAnsi="Times New Roman" w:cs="Times New Roman"/>
+          <w:sz w:val="24"/>
+          <w:szCs w:val="24"/>
+        </w:rPr>
+      </w:pPr>
+      <w:r>
+        <w:rPr>
+          <w:rFonts w:ascii="Times New Roman" w:hAnsi="Times New Roman" w:cs="Times New Roman"/>
+          <w:sz w:val="24"/>
+          <w:szCs w:val="24"/>
+        </w:rPr>
+        <w:t xml:space="preserve">To address the need for sequential data processing, Deep Neural Networks (DNN) were applied on online learning platform data [9], analyzing video watch times to reach high accuracy. Further advancements proposed a Long Short-Term Memory (LSTM) network to forecast dropouts using multifaceted data [1], </w:t>
+      </w:r>
+      <w:proofErr w:type="gramStart"/>
+      <w:r>
+        <w:rPr>
+          <w:rFonts w:ascii="Times New Roman" w:hAnsi="Times New Roman" w:cs="Times New Roman"/>
+          <w:sz w:val="24"/>
+          <w:szCs w:val="24"/>
+        </w:rPr>
+        <w:t xml:space="preserve">successfully </w:t>
+      </w:r>
+      <w:r>
+        <w:rPr>
+          <w:rFonts w:ascii="Times New Roman" w:hAnsi="Times New Roman" w:cs="Times New Roman"/>
+          <w:sz w:val="24"/>
+          <w:szCs w:val="24"/>
+        </w:rPr>
+        <w:t xml:space="preserve"> </w:t>
+      </w:r>
+      <w:r>
+        <w:rPr>
+          <w:rFonts w:ascii="Times New Roman" w:hAnsi="Times New Roman" w:cs="Times New Roman"/>
+          <w:sz w:val="24"/>
+          <w:szCs w:val="24"/>
+        </w:rPr>
+        <w:t>identifying</w:t>
+      </w:r>
+      <w:proofErr w:type="gramEnd"/>
+      <w:r>
+        <w:rPr>
+          <w:rFonts w:ascii="Times New Roman" w:hAnsi="Times New Roman" w:cs="Times New Roman"/>
+          <w:sz w:val="24"/>
+          <w:szCs w:val="24"/>
+        </w:rPr>
+        <w:t xml:space="preserve"> noticeable clustering patterns. The critical drawback of both of these deep learning frameworks is that they act as "black boxes" and completely lack transparency or explainability (XAI) in their decision-making processes.</w:t>
+      </w:r>
+    </w:p>
+    <w:p>
+      <w:pPr>
+        <w:rPr>
+          <w:rFonts w:ascii="Times New Roman" w:hAnsi="Times New Roman" w:cs="Times New Roman"/>
+          <w:sz w:val="24"/>
+          <w:szCs w:val="24"/>
+        </w:rPr>
+      </w:pPr>
+      <w:r>
+        <w:rPr>
+          <w:rFonts w:ascii="Times New Roman" w:hAnsi="Times New Roman" w:cs="Times New Roman"/>
+          <w:sz w:val="24"/>
+          <w:szCs w:val="24"/>
+        </w:rPr>
+        <w:t xml:space="preserve">To introduce interpretability into educational machine learning, Explainable AI (XAI) was applied to predict students' adaptability [6]. Similarly, </w:t>
+      </w:r>
+      <w:proofErr w:type="spellStart"/>
+      <w:r>
+        <w:rPr>
+          <w:rFonts w:ascii="Times New Roman" w:hAnsi="Times New Roman" w:cs="Times New Roman"/>
+          <w:sz w:val="24"/>
+          <w:szCs w:val="24"/>
+        </w:rPr>
+        <w:t>XGBoost</w:t>
+      </w:r>
+      <w:proofErr w:type="spellEnd"/>
+      <w:r>
+        <w:rPr>
+          <w:rFonts w:ascii="Times New Roman" w:hAnsi="Times New Roman" w:cs="Times New Roman"/>
+          <w:sz w:val="24"/>
+          <w:szCs w:val="24"/>
+        </w:rPr>
+        <w:t xml:space="preserve"> paired with SHAP was utilized to assess dropout risk using </w:t>
+      </w:r>
+      <w:proofErr w:type="gramStart"/>
+      <w:r>
+        <w:rPr>
+          <w:rFonts w:ascii="Times New Roman" w:hAnsi="Times New Roman" w:cs="Times New Roman"/>
+          <w:sz w:val="24"/>
+          <w:szCs w:val="24"/>
+        </w:rPr>
+        <w:t>socioeconomic</w:t>
+      </w:r>
+      <w:r>
+        <w:rPr>
+          <w:rFonts w:ascii="Times New Roman" w:hAnsi="Times New Roman" w:cs="Times New Roman"/>
+          <w:sz w:val="24"/>
+          <w:szCs w:val="24"/>
+        </w:rPr>
+        <w:t xml:space="preserve"> </w:t>
+      </w:r>
+      <w:r>
+        <w:rPr>
+          <w:rFonts w:ascii="Times New Roman" w:hAnsi="Times New Roman" w:cs="Times New Roman"/>
+          <w:sz w:val="24"/>
+          <w:szCs w:val="24"/>
+        </w:rPr>
+        <w:t xml:space="preserve"> status</w:t>
+      </w:r>
+      <w:proofErr w:type="gramEnd"/>
+      <w:r>
+        <w:rPr>
+          <w:rFonts w:ascii="Times New Roman" w:hAnsi="Times New Roman" w:cs="Times New Roman"/>
+          <w:sz w:val="24"/>
+          <w:szCs w:val="24"/>
+        </w:rPr>
+        <w:t xml:space="preserve"> and attendance [10]. While these achieved good interpretability, their major limitation lies in focusing on static, single-semester features rather than tracking dynamic, multi-semester temporal data. Furthermore, XAI-based personalized </w:t>
+      </w:r>
+      <w:proofErr w:type="gramStart"/>
+      <w:r>
+        <w:rPr>
+          <w:rFonts w:ascii="Times New Roman" w:hAnsi="Times New Roman" w:cs="Times New Roman"/>
+          <w:sz w:val="24"/>
+          <w:szCs w:val="24"/>
+        </w:rPr>
+        <w:t>interventions</w:t>
+      </w:r>
+      <w:r>
+        <w:rPr>
+          <w:rFonts w:ascii="Times New Roman" w:hAnsi="Times New Roman" w:cs="Times New Roman"/>
+          <w:sz w:val="24"/>
+          <w:szCs w:val="24"/>
+        </w:rPr>
+        <w:t xml:space="preserve"> </w:t>
+      </w:r>
+      <w:r>
+        <w:rPr>
+          <w:rFonts w:ascii="Times New Roman" w:hAnsi="Times New Roman" w:cs="Times New Roman"/>
+          <w:sz w:val="24"/>
+          <w:szCs w:val="24"/>
+        </w:rPr>
+        <w:t xml:space="preserve"> were</w:t>
+      </w:r>
+      <w:proofErr w:type="gramEnd"/>
+      <w:r>
+        <w:rPr>
+          <w:rFonts w:ascii="Times New Roman" w:hAnsi="Times New Roman" w:cs="Times New Roman"/>
+          <w:sz w:val="24"/>
+          <w:szCs w:val="24"/>
+        </w:rPr>
+        <w:t xml:space="preserve"> advocated [5], but predominantly relied on static interpretable models rather than deep sequential ones.</w:t>
       </w:r>
     </w:p>
     <w:p>
@@ -3419,26 +3931,181 @@
       <w:pPr>
         <w:rPr>
           <w:rFonts w:ascii="Times New Roman" w:hAnsi="Times New Roman" w:cs="Times New Roman"/>
-          <w:sz w:val="24"/>
-          <w:szCs w:val="24"/>
-        </w:rPr>
-      </w:pPr>
-      <w:r>
-        <w:rPr>
-          <w:rFonts w:ascii="Times New Roman" w:hAnsi="Times New Roman" w:cs="Times New Roman"/>
-          <w:sz w:val="24"/>
-          <w:szCs w:val="24"/>
-        </w:rPr>
-        <w:t>Summarize</w:t>
-      </w:r>
-      <w:r>
-        <w:rPr>
-          <w:rFonts w:ascii="Times New Roman" w:hAnsi="Times New Roman" w:cs="Times New Roman"/>
-          <w:sz w:val="24"/>
-          <w:szCs w:val="24"/>
-        </w:rPr>
-        <w:t xml:space="preserve"> the gap you have observed from the background study</w:t>
-      </w:r>
+          <w:b/>
+          <w:bCs/>
+          <w:sz w:val="24"/>
+          <w:szCs w:val="24"/>
+        </w:rPr>
+      </w:pPr>
+      <w:r>
+        <w:drawing>
+          <wp:inline distT="0" distB="0" distL="0" distR="0" wp14:anchorId="4901874E" wp14:editId="666FBAAA">
+            <wp:extent cx="5943600" cy="2605405"/>
+            <wp:effectExtent l="0" t="0" r="0" b="4445"/>
+            <wp:docPr id="401876465" name="Picture 2"/>
+            <wp:cNvGraphicFramePr>
+              <a:graphicFrameLocks xmlns:a="http://schemas.openxmlformats.org/drawingml/2006/main" noChangeAspect="1"/>
+            </wp:cNvGraphicFramePr>
+            <a:graphic xmlns:a="http://schemas.openxmlformats.org/drawingml/2006/main">
+              <a:graphicData uri="http://schemas.openxmlformats.org/drawingml/2006/picture">
+                <pic:pic xmlns:pic="http://schemas.openxmlformats.org/drawingml/2006/picture">
+                  <pic:nvPicPr>
+                    <pic:cNvPr id="0" name="Picture 2"/>
+                    <pic:cNvPicPr>
+                      <a:picLocks noChangeAspect="1" noChangeArrowheads="1"/>
+                    </pic:cNvPicPr>
+                  </pic:nvPicPr>
+                  <pic:blipFill>
+                    <a:blip r:embed="rId9">
+                      <a:extLst>
+                        <a:ext uri="{28A0092B-C50C-407E-A947-70E740481C1C}">
+                          <a14:useLocalDpi xmlns:a14="http://schemas.microsoft.com/office/drawing/2010/main" val="0"/>
+                        </a:ext>
+                      </a:extLst>
+                    </a:blip>
+                    <a:srcRect/>
+                    <a:stretch>
+                      <a:fillRect/>
+                    </a:stretch>
+                  </pic:blipFill>
+                  <pic:spPr bwMode="auto">
+                    <a:xfrm>
+                      <a:off x="0" y="0"/>
+                      <a:ext cx="5943600" cy="2605405"/>
+                    </a:xfrm>
+                    <a:prstGeom prst="rect">
+                      <a:avLst/>
+                    </a:prstGeom>
+                    <a:noFill/>
+                    <a:ln>
+                      <a:noFill/>
+                    </a:ln>
+                  </pic:spPr>
+                </pic:pic>
+              </a:graphicData>
+            </a:graphic>
+          </wp:inline>
+        </w:drawing>
+      </w:r>
+    </w:p>
+    <w:p>
+      <w:pPr>
+        <w:pStyle w:val="NormalWeb"/>
+      </w:pPr>
+      <w:r>
+        <w:rPr>
+          <w:b/>
+          <w:bCs/>
+        </w:rPr>
+        <w:t>Gap Analysis</w:t>
+      </w:r>
+    </w:p>
+    <w:p>
+      <w:pPr>
+        <w:pStyle w:val="NormalWeb"/>
+      </w:pPr>
+      <w:r>
+        <w:t xml:space="preserve">The comparative analysis of the existing literature highlights a significant over-reliance on static data analysis for student dropout prediction. Most existing studies primarily depend on static machine learning models, such </w:t>
+      </w:r>
+      <w:proofErr w:type="gramStart"/>
+      <w:r>
+        <w:t>as</w:t>
+      </w:r>
+      <w:r>
+        <w:t xml:space="preserve"> </w:t>
+      </w:r>
+      <w:r>
+        <w:t xml:space="preserve"> Random</w:t>
+      </w:r>
+      <w:proofErr w:type="gramEnd"/>
+      <w:r>
+        <w:t xml:space="preserve"> Forest, </w:t>
+      </w:r>
+      <w:proofErr w:type="spellStart"/>
+      <w:r>
+        <w:t>XGBoost</w:t>
+      </w:r>
+      <w:proofErr w:type="spellEnd"/>
+      <w:r>
+        <w:t xml:space="preserve">, and Logistic Regression, using cross-sectional data. While these conventional models provide reasonable predictive accuracy based on a single snapshot of information, they completely fail to track the dynamic, semester-by-semester academic progression of a student. Consequently, they are unable to analyze the data </w:t>
+      </w:r>
+      <w:proofErr w:type="gramStart"/>
+      <w:r>
+        <w:t xml:space="preserve">as </w:t>
+      </w:r>
+      <w:r>
+        <w:t xml:space="preserve"> </w:t>
+      </w:r>
+      <w:r>
+        <w:t>a</w:t>
+      </w:r>
+      <w:proofErr w:type="gramEnd"/>
+      <w:r>
+        <w:t xml:space="preserve"> continuous sequence of academic events, missing the crucial temporal changes in student behavior over time.</w:t>
+      </w:r>
+    </w:p>
+    <w:p>
+      <w:pPr>
+        <w:pStyle w:val="NormalWeb"/>
+      </w:pPr>
+      <w:r>
+        <w:t xml:space="preserve">To address the need for sequential data processing, some recent studies have successfully applied deep learning frameworks, specifically Long Short-Term Memory (LSTM) networks, to capture temporal dependencies. However, these advanced temporal models inherently function as "black boxes," failing to offer any interpretability or transparent explanation regarding why a particular student is </w:t>
+      </w:r>
+      <w:proofErr w:type="gramStart"/>
+      <w:r>
+        <w:t>classified</w:t>
+      </w:r>
+      <w:r>
+        <w:t xml:space="preserve"> </w:t>
+      </w:r>
+      <w:r>
+        <w:t xml:space="preserve"> as</w:t>
+      </w:r>
+      <w:proofErr w:type="gramEnd"/>
+      <w:r>
+        <w:t xml:space="preserve"> at-risk. On the other hand, while Explainable AI (XAI) tools like SHAP have been introduced to educational data mining, their application remains strictly restricted to static, non-sequential models. There is a distinct absence of research that effectively integrates robust interpretability with dynamic, multi-semester tracking.</w:t>
+      </w:r>
+    </w:p>
+    <w:p>
+      <w:pPr>
+        <w:pStyle w:val="NormalWeb"/>
+      </w:pPr>
+      <w:r>
+        <w:t>Our proposed system explicitly addresses these identified research gaps by developing an integrated framework. By utilizing an LSTM network, the model effectively captures the long-term temporal dependencies of a student's academic journey across multiple semesters. Simultaneously, by integrating SHAP (</w:t>
+      </w:r>
+      <w:proofErr w:type="spellStart"/>
+      <w:r>
+        <w:t>S</w:t>
+      </w:r>
+      <w:r>
+        <w:t>H</w:t>
+      </w:r>
+      <w:r>
+        <w:t>apley</w:t>
+      </w:r>
+      <w:proofErr w:type="spellEnd"/>
+      <w:r>
+        <w:t xml:space="preserve"> Additive </w:t>
+      </w:r>
+      <w:proofErr w:type="spellStart"/>
+      <w:r>
+        <w:t>exPlanations</w:t>
+      </w:r>
+      <w:proofErr w:type="spellEnd"/>
+      <w:r>
+        <w:t>), we crack open the "black box" of the LSTM architecture to provide transparent, personalized explanations for every single prediction. This unique combination of dynamic sequence tracking and robust individual interpretability provides a comprehensive and actionable solution that is largely missing in the current educational data mining literature.</w:t>
+      </w:r>
+    </w:p>
+    <w:p>
+      <w:pPr>
+        <w:rPr>
+          <w:rFonts w:ascii="Times New Roman" w:hAnsi="Times New Roman" w:cs="Times New Roman"/>
+          <w:b/>
+          <w:bCs/>
+          <w:sz w:val="24"/>
+          <w:szCs w:val="24"/>
+        </w:rPr>
+      </w:pPr>
     </w:p>
     <w:p>
       <w:pPr>
@@ -3731,7 +4398,6 @@
           <w:sz w:val="24"/>
           <w:szCs w:val="24"/>
         </w:rPr>
-        <w:lastRenderedPageBreak/>
         <w:drawing>
           <wp:inline distT="0" distB="0" distL="0" distR="0" wp14:anchorId="2BF2050A" wp14:editId="5F52AFD1">
             <wp:extent cx="5943600" cy="6698615"/>
@@ -3748,7 +4414,7 @@
                     <pic:cNvPicPr/>
                   </pic:nvPicPr>
                   <pic:blipFill>
-                    <a:blip r:embed="rId9">
+                    <a:blip r:embed="rId10">
                       <a:extLst>
                         <a:ext uri="{28A0092B-C50C-407E-A947-70E740481C1C}">
                           <a14:useLocalDpi xmlns:a14="http://schemas.microsoft.com/office/drawing/2010/main" val="0"/>
@@ -3806,16 +4472,7 @@
           <w:sz w:val="24"/>
           <w:szCs w:val="24"/>
         </w:rPr>
-        <w:t xml:space="preserve">The research process began with dataset selection and understanding, followed by Exploratory Data Analysis (EDA) to examine the dataset's characteristics, feature distributions, and class </w:t>
-      </w:r>
-      <w:r>
-        <w:rPr>
-          <w:rFonts w:ascii="Times New Roman" w:hAnsi="Times New Roman" w:cs="Times New Roman"/>
-          <w:sz w:val="24"/>
-          <w:szCs w:val="24"/>
-        </w:rPr>
-        <w:lastRenderedPageBreak/>
-        <w:t>balance. Based on the EDA findings, the dataset was preprocessed by encoding categorical variables and splitting the data into training and testing sets.</w:t>
+        <w:t>The research process began with dataset selection and understanding, followed by Exploratory Data Analysis (EDA) to examine the dataset's characteristics, feature distributions, and class balance. Based on the EDA findings, the dataset was preprocessed by encoding categorical variables and splitting the data into training and testing sets.</w:t>
       </w:r>
     </w:p>
     <w:p>
@@ -3953,16 +4610,7 @@
           <w:sz w:val="24"/>
           <w:szCs w:val="24"/>
         </w:rPr>
-        <w:t xml:space="preserve">The collected data includes students' demographic information, academic background, socioeconomic status, financial information, </w:t>
-      </w:r>
-      <w:proofErr w:type="gramStart"/>
-      <w:r>
-        <w:rPr>
-          <w:rFonts w:ascii="Times New Roman" w:hAnsi="Times New Roman" w:cs="Times New Roman"/>
-          <w:sz w:val="24"/>
-          <w:szCs w:val="24"/>
-        </w:rPr>
-        <w:t xml:space="preserve">and </w:t>
+        <w:t>The collected data includes students' demographic information, academic background, socioeconomic status, financial information, and</w:t>
       </w:r>
       <w:r>
         <w:rPr>
@@ -3978,50 +4626,7 @@
           <w:sz w:val="24"/>
           <w:szCs w:val="24"/>
         </w:rPr>
-        <w:t>academic</w:t>
-      </w:r>
-      <w:proofErr w:type="gramEnd"/>
-      <w:r>
-        <w:rPr>
-          <w:rFonts w:ascii="Times New Roman" w:hAnsi="Times New Roman" w:cs="Times New Roman"/>
-          <w:sz w:val="24"/>
-          <w:szCs w:val="24"/>
-        </w:rPr>
-        <w:t xml:space="preserve"> performance during the first and second semesters. Since the dataset was already preprocessed </w:t>
-      </w:r>
-      <w:proofErr w:type="gramStart"/>
-      <w:r>
-        <w:rPr>
-          <w:rFonts w:ascii="Times New Roman" w:hAnsi="Times New Roman" w:cs="Times New Roman"/>
-          <w:sz w:val="24"/>
-          <w:szCs w:val="24"/>
-        </w:rPr>
-        <w:t xml:space="preserve">by </w:t>
-      </w:r>
-      <w:r>
-        <w:rPr>
-          <w:rFonts w:ascii="Times New Roman" w:hAnsi="Times New Roman" w:cs="Times New Roman"/>
-          <w:sz w:val="24"/>
-          <w:szCs w:val="24"/>
-        </w:rPr>
-        <w:t xml:space="preserve"> </w:t>
-      </w:r>
-      <w:r>
-        <w:rPr>
-          <w:rFonts w:ascii="Times New Roman" w:hAnsi="Times New Roman" w:cs="Times New Roman"/>
-          <w:sz w:val="24"/>
-          <w:szCs w:val="24"/>
-        </w:rPr>
-        <w:t>its</w:t>
-      </w:r>
-      <w:proofErr w:type="gramEnd"/>
-      <w:r>
-        <w:rPr>
-          <w:rFonts w:ascii="Times New Roman" w:hAnsi="Times New Roman" w:cs="Times New Roman"/>
-          <w:sz w:val="24"/>
-          <w:szCs w:val="24"/>
-        </w:rPr>
-        <w:t xml:space="preserve"> creators, it contains no missing values or significant anomalies, making it suitable for machine learning analysis.</w:t>
+        <w:t>academic performance during the first and second semesters. Since the dataset was already preprocessed by its creators, it contains no missing values or significant anomalies, making it suitable for machine learning analysis.</w:t>
       </w:r>
     </w:p>
     <w:p>
@@ -4073,21 +4678,7 @@
         <w:pStyle w:val="NormalWeb"/>
       </w:pPr>
       <w:r>
-        <w:t xml:space="preserve">The analysis was conducted using Python and its </w:t>
-      </w:r>
-      <w:proofErr w:type="gramStart"/>
-      <w:r>
-        <w:t xml:space="preserve">data </w:t>
-      </w:r>
-      <w:r>
-        <w:t xml:space="preserve"> </w:t>
-      </w:r>
-      <w:r>
-        <w:t>science</w:t>
-      </w:r>
-      <w:proofErr w:type="gramEnd"/>
-      <w:r>
-        <w:t xml:space="preserve"> libraries, including Pandas, NumPy, Matplotlib, Seaborn, and Scikit-learn. Initially, </w:t>
+        <w:t xml:space="preserve">The analysis was conducted using Python and its data science libraries, including Pandas, NumPy, Matplotlib, Seaborn, and Scikit-learn. Initially, </w:t>
       </w:r>
       <w:r>
         <w:rPr>
@@ -4104,21 +4695,21 @@
         <w:t>)</w:t>
       </w:r>
       <w:r>
-        <w:t xml:space="preserve"> was performed to understand the dataset structure, identify feature </w:t>
+        <w:t xml:space="preserve"> was performed to understand the dataset </w:t>
       </w:r>
       <w:proofErr w:type="gramStart"/>
       <w:r>
-        <w:t xml:space="preserve">types, </w:t>
+        <w:t>structure,</w:t>
       </w:r>
       <w:r>
         <w:t xml:space="preserve"> </w:t>
       </w:r>
       <w:r>
-        <w:t>examine</w:t>
+        <w:t xml:space="preserve"> identify</w:t>
       </w:r>
       <w:proofErr w:type="gramEnd"/>
       <w:r>
-        <w:t xml:space="preserve"> class distribution, detect duplicate records, and analyze relationships among variables using descriptive statistics and visualization techniques.</w:t>
+        <w:t xml:space="preserve"> feature types, examine class distribution, detect duplicate records, and analyze relationships among variables using descriptive statistics and visualization techniques.</w:t>
       </w:r>
     </w:p>
     <w:p>
@@ -4126,33 +4717,37 @@
         <w:pStyle w:val="NormalWeb"/>
       </w:pPr>
       <w:r>
-        <w:t xml:space="preserve">After EDA, the dataset was preprocessed by encoding </w:t>
+        <w:t xml:space="preserve">After EDA, the dataset was preprocessed by encoding categorical variables and splitting the data into training and testing sets. A </w:t>
+      </w:r>
+      <w:r>
+        <w:t xml:space="preserve">  </w:t>
       </w:r>
       <w:proofErr w:type="gramStart"/>
-      <w:r>
-        <w:t xml:space="preserve">categorical </w:t>
-      </w:r>
-      <w:r>
-        <w:t xml:space="preserve"> </w:t>
-      </w:r>
-      <w:r>
-        <w:t>variables</w:t>
-      </w:r>
-      <w:proofErr w:type="gramEnd"/>
-      <w:r>
-        <w:t xml:space="preserve"> and splitting the data into training and testing sets. A </w:t>
-      </w:r>
-      <w:r>
-        <w:t xml:space="preserve">  </w:t>
-      </w:r>
       <w:r>
         <w:rPr>
           <w:rStyle w:val="Strong"/>
           <w:b w:val="0"/>
           <w:bCs w:val="0"/>
         </w:rPr>
-        <w:t>Random Forest</w:t>
-      </w:r>
+        <w:t xml:space="preserve">Random </w:t>
+      </w:r>
+      <w:r>
+        <w:rPr>
+          <w:rStyle w:val="Strong"/>
+          <w:b w:val="0"/>
+          <w:bCs w:val="0"/>
+        </w:rPr>
+        <w:t xml:space="preserve"> </w:t>
+      </w:r>
+      <w:r>
+        <w:rPr>
+          <w:rStyle w:val="Strong"/>
+          <w:b w:val="0"/>
+          <w:bCs w:val="0"/>
+        </w:rPr>
+        <w:t>Forest</w:t>
+      </w:r>
+      <w:proofErr w:type="gramEnd"/>
       <w:r>
         <w:t xml:space="preserve"> classifier was then developed as the baseline machine learning model to predict student dropout. The model's performance was evaluated using standard classification metrics, including </w:t>
       </w:r>
@@ -4215,7 +4810,6 @@
           <w:sz w:val="28"/>
           <w:szCs w:val="28"/>
         </w:rPr>
-        <w:lastRenderedPageBreak/>
         <w:t>Progress Achieved:</w:t>
       </w:r>
     </w:p>
@@ -4264,21 +4858,7 @@
         <w:pStyle w:val="NormalWeb"/>
       </w:pPr>
       <w:r>
-        <w:t xml:space="preserve">During </w:t>
-      </w:r>
-      <w:proofErr w:type="gramStart"/>
-      <w:r>
-        <w:t xml:space="preserve">this </w:t>
-      </w:r>
-      <w:r>
-        <w:t xml:space="preserve"> </w:t>
-      </w:r>
-      <w:r>
-        <w:t>reporting</w:t>
-      </w:r>
-      <w:proofErr w:type="gramEnd"/>
-      <w:r>
-        <w:t xml:space="preserve"> period, the following tasks and milestones were successfully completed:</w:t>
+        <w:t>During this reporting period, the following tasks and milestones were successfully completed:</w:t>
       </w:r>
     </w:p>
     <w:p>
@@ -4314,21 +4894,13 @@
         <w:t>Research Planning:</w:t>
       </w:r>
       <w:r>
+        <w:t xml:space="preserve"> Finalized</w:t>
+      </w:r>
+      <w:r>
         <w:t xml:space="preserve"> </w:t>
       </w:r>
-      <w:proofErr w:type="gramStart"/>
-      <w:r>
-        <w:t>Finalized</w:t>
-      </w:r>
-      <w:r>
-        <w:t xml:space="preserve"> </w:t>
-      </w:r>
-      <w:r>
-        <w:t xml:space="preserve"> the</w:t>
-      </w:r>
-      <w:proofErr w:type="gramEnd"/>
-      <w:r>
-        <w:t xml:space="preserve"> research objectives, research questions, methodology, and selected the project title with supervisor approval.</w:t>
+      <w:r>
+        <w:t>the research objectives, research questions, methodology, and selected the project title with supervisor approval.</w:t>
       </w:r>
     </w:p>
     <w:p>
@@ -4354,39 +4926,13 @@
         </w:rPr>
         <w:t>"</w:t>
       </w:r>
-      <w:proofErr w:type="gramStart"/>
       <w:r>
         <w:rPr>
           <w:rStyle w:val="Strong"/>
           <w:b w:val="0"/>
           <w:bCs w:val="0"/>
         </w:rPr>
-        <w:t xml:space="preserve">Predict </w:t>
-      </w:r>
-      <w:r>
-        <w:rPr>
-          <w:rStyle w:val="Strong"/>
-          <w:b w:val="0"/>
-          <w:bCs w:val="0"/>
-        </w:rPr>
-        <w:t xml:space="preserve"> </w:t>
-      </w:r>
-      <w:r>
-        <w:rPr>
-          <w:rStyle w:val="Strong"/>
-          <w:b w:val="0"/>
-          <w:bCs w:val="0"/>
-        </w:rPr>
-        <w:t>Students</w:t>
-      </w:r>
-      <w:proofErr w:type="gramEnd"/>
-      <w:r>
-        <w:rPr>
-          <w:rStyle w:val="Strong"/>
-          <w:b w:val="0"/>
-          <w:bCs w:val="0"/>
-        </w:rPr>
-        <w:t xml:space="preserve"> Dropout and Academic Success</w:t>
+        <w:t>Predict Students Dropout and Academic Success</w:t>
       </w:r>
       <w:r>
         <w:rPr>
@@ -4687,16 +5233,7 @@
           <w:sz w:val="24"/>
           <w:szCs w:val="24"/>
         </w:rPr>
-        <w:t xml:space="preserve">Units (1st Semester Grade), Admission </w:t>
-      </w:r>
-      <w:r>
-        <w:rPr>
-          <w:rFonts w:ascii="Times New Roman" w:hAnsi="Times New Roman" w:cs="Times New Roman"/>
-          <w:sz w:val="24"/>
-          <w:szCs w:val="24"/>
-        </w:rPr>
-        <w:lastRenderedPageBreak/>
-        <w:t>Grade, and Age at Enrollment were among the most influential features for predicting student outcomes.</w:t>
+        <w:t>Units (1st Semester Grade), Admission Grade, and Age at Enrollment were among the most influential features for predicting student outcomes.</w:t>
       </w:r>
     </w:p>
     <w:p>
@@ -5674,7 +6211,6 @@
                 <w:sz w:val="24"/>
                 <w:szCs w:val="24"/>
               </w:rPr>
-              <w:lastRenderedPageBreak/>
               <w:t>3</w:t>
             </w:r>
           </w:p>
@@ -9163,7 +9699,6 @@
                 <w:sz w:val="24"/>
                 <w:szCs w:val="24"/>
               </w:rPr>
-              <w:lastRenderedPageBreak/>
               <w:t>2</w:t>
             </w:r>
           </w:p>
@@ -9659,8 +10194,59 @@
           <w:sz w:val="24"/>
           <w:szCs w:val="24"/>
         </w:rPr>
-        <w:t>Project</w:t>
-      </w:r>
+        <w:t>Project Management:</w:t>
+      </w:r>
+      <w:r>
+        <w:rPr>
+          <w:rFonts w:ascii="Times New Roman" w:hAnsi="Times New Roman" w:cs="Times New Roman"/>
+          <w:sz w:val="24"/>
+          <w:szCs w:val="24"/>
+        </w:rPr>
+        <w:t xml:space="preserve"> The project is being managed using a phased development approach. Phase 1 focused on literature review, dataset collection, exploratory data analysis (EDA), and developing </w:t>
+      </w:r>
+      <w:proofErr w:type="gramStart"/>
+      <w:r>
+        <w:rPr>
+          <w:rFonts w:ascii="Times New Roman" w:hAnsi="Times New Roman" w:cs="Times New Roman"/>
+          <w:sz w:val="24"/>
+          <w:szCs w:val="24"/>
+        </w:rPr>
+        <w:t xml:space="preserve">a </w:t>
+      </w:r>
+      <w:r>
+        <w:rPr>
+          <w:rFonts w:ascii="Times New Roman" w:hAnsi="Times New Roman" w:cs="Times New Roman"/>
+          <w:sz w:val="24"/>
+          <w:szCs w:val="24"/>
+        </w:rPr>
+        <w:t xml:space="preserve"> </w:t>
+      </w:r>
+      <w:r>
+        <w:rPr>
+          <w:rFonts w:ascii="Times New Roman" w:hAnsi="Times New Roman" w:cs="Times New Roman"/>
+          <w:sz w:val="24"/>
+          <w:szCs w:val="24"/>
+        </w:rPr>
+        <w:t>baseline</w:t>
+      </w:r>
+      <w:proofErr w:type="gramEnd"/>
+      <w:r>
+        <w:rPr>
+          <w:rFonts w:ascii="Times New Roman" w:hAnsi="Times New Roman" w:cs="Times New Roman"/>
+          <w:sz w:val="24"/>
+          <w:szCs w:val="24"/>
+        </w:rPr>
+        <w:t xml:space="preserve"> machine learning model. Future phases will include feature selection, model comparison, explainability (SHAP), evaluation, and documentation. Progress is monitored through regular meetings with the project supervisor. </w:t>
+      </w:r>
+    </w:p>
+    <w:p>
+      <w:pPr>
+        <w:rPr>
+          <w:rFonts w:ascii="Times New Roman" w:hAnsi="Times New Roman" w:cs="Times New Roman"/>
+          <w:sz w:val="24"/>
+          <w:szCs w:val="24"/>
+        </w:rPr>
+      </w:pPr>
       <w:r>
         <w:rPr>
           <w:rFonts w:ascii="Times New Roman" w:hAnsi="Times New Roman" w:cs="Times New Roman"/>
@@ -9669,54 +10255,7 @@
           <w:sz w:val="24"/>
           <w:szCs w:val="24"/>
         </w:rPr>
-        <w:t xml:space="preserve"> Management</w:t>
-      </w:r>
-      <w:r>
-        <w:rPr>
-          <w:rFonts w:ascii="Times New Roman" w:hAnsi="Times New Roman" w:cs="Times New Roman"/>
-          <w:b/>
-          <w:bCs/>
-          <w:sz w:val="24"/>
-          <w:szCs w:val="24"/>
-        </w:rPr>
-        <w:t>:</w:t>
-      </w:r>
-      <w:r>
-        <w:rPr>
-          <w:rFonts w:ascii="Times New Roman" w:hAnsi="Times New Roman" w:cs="Times New Roman"/>
-          <w:sz w:val="24"/>
-          <w:szCs w:val="24"/>
-        </w:rPr>
-        <w:t xml:space="preserve"> The project is being managed using a phased development approach. Phase 1 focused on literature review, dataset collection, exploratory data analysis (EDA), and developing a baseline machine learning model. Future phases will include feature selection, model comparison, explainability (SHAP), evaluation, and documentation. Progress is monitored through regular meetings with the project supervisor. </w:t>
-      </w:r>
-    </w:p>
-    <w:p>
-      <w:pPr>
-        <w:rPr>
-          <w:rFonts w:ascii="Times New Roman" w:hAnsi="Times New Roman" w:cs="Times New Roman"/>
-          <w:sz w:val="24"/>
-          <w:szCs w:val="24"/>
-        </w:rPr>
-      </w:pPr>
-      <w:r>
-        <w:rPr>
-          <w:rFonts w:ascii="Times New Roman" w:hAnsi="Times New Roman" w:cs="Times New Roman"/>
-          <w:b/>
-          <w:bCs/>
-          <w:sz w:val="24"/>
-          <w:szCs w:val="24"/>
-        </w:rPr>
-        <w:t>Estimated Cost</w:t>
-      </w:r>
-      <w:r>
-        <w:rPr>
-          <w:rFonts w:ascii="Times New Roman" w:hAnsi="Times New Roman" w:cs="Times New Roman"/>
-          <w:b/>
-          <w:bCs/>
-          <w:sz w:val="24"/>
-          <w:szCs w:val="24"/>
-        </w:rPr>
-        <w:t>:</w:t>
+        <w:t>Estimated Cost:</w:t>
       </w:r>
       <w:r>
         <w:rPr>
@@ -9732,7 +10271,41 @@
           <w:sz w:val="24"/>
           <w:szCs w:val="24"/>
         </w:rPr>
-        <w:t xml:space="preserve"> The project requires minimal financial expenditure as it utilizes open-source software and publicly available datasets. The estimated cost is limited to electricity and internet usage during development. Existing personal computing resources are used, so no additional hardware or software purchases are required.</w:t>
+        <w:t xml:space="preserve"> The project requires minimal financial expenditure as it utilizes open-source software and </w:t>
+      </w:r>
+      <w:proofErr w:type="gramStart"/>
+      <w:r>
+        <w:rPr>
+          <w:rFonts w:ascii="Times New Roman" w:hAnsi="Times New Roman" w:cs="Times New Roman"/>
+          <w:sz w:val="24"/>
+          <w:szCs w:val="24"/>
+        </w:rPr>
+        <w:t xml:space="preserve">publicly </w:t>
+      </w:r>
+      <w:r>
+        <w:rPr>
+          <w:rFonts w:ascii="Times New Roman" w:hAnsi="Times New Roman" w:cs="Times New Roman"/>
+          <w:sz w:val="24"/>
+          <w:szCs w:val="24"/>
+        </w:rPr>
+        <w:t xml:space="preserve"> </w:t>
+      </w:r>
+      <w:r>
+        <w:rPr>
+          <w:rFonts w:ascii="Times New Roman" w:hAnsi="Times New Roman" w:cs="Times New Roman"/>
+          <w:sz w:val="24"/>
+          <w:szCs w:val="24"/>
+        </w:rPr>
+        <w:t>available</w:t>
+      </w:r>
+      <w:proofErr w:type="gramEnd"/>
+      <w:r>
+        <w:rPr>
+          <w:rFonts w:ascii="Times New Roman" w:hAnsi="Times New Roman" w:cs="Times New Roman"/>
+          <w:sz w:val="24"/>
+          <w:szCs w:val="24"/>
+        </w:rPr>
+        <w:t xml:space="preserve"> datasets. The estimated cost is limited to electricity and internet usage during development. Existing personal computing resources are used, so no additional hardware or software purchases are required.</w:t>
       </w:r>
     </w:p>
     <w:p>
@@ -9878,7 +10451,41 @@
           <w:sz w:val="24"/>
           <w:szCs w:val="24"/>
         </w:rPr>
-        <w:t xml:space="preserve"> Applying hyperparameter tuning and cross-validation to improve the performance and generalization of the selected model. </w:t>
+        <w:t xml:space="preserve"> Applying hyperparameter </w:t>
+      </w:r>
+      <w:proofErr w:type="gramStart"/>
+      <w:r>
+        <w:rPr>
+          <w:rFonts w:ascii="Times New Roman" w:hAnsi="Times New Roman" w:cs="Times New Roman"/>
+          <w:sz w:val="24"/>
+          <w:szCs w:val="24"/>
+        </w:rPr>
+        <w:t xml:space="preserve">tuning </w:t>
+      </w:r>
+      <w:r>
+        <w:rPr>
+          <w:rFonts w:ascii="Times New Roman" w:hAnsi="Times New Roman" w:cs="Times New Roman"/>
+          <w:sz w:val="24"/>
+          <w:szCs w:val="24"/>
+        </w:rPr>
+        <w:t xml:space="preserve"> </w:t>
+      </w:r>
+      <w:r>
+        <w:rPr>
+          <w:rFonts w:ascii="Times New Roman" w:hAnsi="Times New Roman" w:cs="Times New Roman"/>
+          <w:sz w:val="24"/>
+          <w:szCs w:val="24"/>
+        </w:rPr>
+        <w:t>and</w:t>
+      </w:r>
+      <w:proofErr w:type="gramEnd"/>
+      <w:r>
+        <w:rPr>
+          <w:rFonts w:ascii="Times New Roman" w:hAnsi="Times New Roman" w:cs="Times New Roman"/>
+          <w:sz w:val="24"/>
+          <w:szCs w:val="24"/>
+        </w:rPr>
+        <w:t xml:space="preserve"> cross-validation to improve the performance and generalization of the selected model. </w:t>
       </w:r>
     </w:p>
     <w:p>
@@ -9932,7 +10539,6 @@
           <w:sz w:val="24"/>
           <w:szCs w:val="24"/>
         </w:rPr>
-        <w:lastRenderedPageBreak/>
         <w:t>Model Evaluation:</w:t>
       </w:r>
       <w:r>
@@ -10038,7 +10644,41 @@
           <w:sz w:val="24"/>
           <w:szCs w:val="24"/>
         </w:rPr>
-        <w:t xml:space="preserve">This progress report summarizes the work completed during the first phase of the Student Dropout Prediction project. The literature review, dataset collection, and Exploratory Data Analysis (EDA) were successfully completed, providing a clear understanding of the dataset and its characteristics. A baseline Random Forest model was developed, achieving an accuracy of </w:t>
+        <w:t xml:space="preserve">This progress report summarizes the work completed during the first phase of the Student Dropout Prediction project. The literature review, dataset collection, and Exploratory Data Analysis (EDA) </w:t>
+      </w:r>
+      <w:proofErr w:type="gramStart"/>
+      <w:r>
+        <w:rPr>
+          <w:rFonts w:ascii="Times New Roman" w:hAnsi="Times New Roman" w:cs="Times New Roman"/>
+          <w:sz w:val="24"/>
+          <w:szCs w:val="24"/>
+        </w:rPr>
+        <w:t xml:space="preserve">were </w:t>
+      </w:r>
+      <w:r>
+        <w:rPr>
+          <w:rFonts w:ascii="Times New Roman" w:hAnsi="Times New Roman" w:cs="Times New Roman"/>
+          <w:sz w:val="24"/>
+          <w:szCs w:val="24"/>
+        </w:rPr>
+        <w:t xml:space="preserve"> </w:t>
+      </w:r>
+      <w:r>
+        <w:rPr>
+          <w:rFonts w:ascii="Times New Roman" w:hAnsi="Times New Roman" w:cs="Times New Roman"/>
+          <w:sz w:val="24"/>
+          <w:szCs w:val="24"/>
+        </w:rPr>
+        <w:t>successfully</w:t>
+      </w:r>
+      <w:proofErr w:type="gramEnd"/>
+      <w:r>
+        <w:rPr>
+          <w:rFonts w:ascii="Times New Roman" w:hAnsi="Times New Roman" w:cs="Times New Roman"/>
+          <w:sz w:val="24"/>
+          <w:szCs w:val="24"/>
+        </w:rPr>
+        <w:t xml:space="preserve"> completed, providing a clear understanding of the dataset and its characteristics. A baseline Random Forest model was developed, achieving an accuracy of </w:t>
       </w:r>
       <w:r>
         <w:rPr>
@@ -10056,7 +10696,41 @@
           <w:sz w:val="24"/>
           <w:szCs w:val="24"/>
         </w:rPr>
-        <w:t>, and feature importance analysis identified the most influential variables for prediction. The completed work provides a solid foundation for the next phase, which will focus on feature selection, model comparison, Explainable AI (SHAP), model optimization, and final evaluation to develop an accurate and interpretable student dropout prediction system.</w:t>
+        <w:t xml:space="preserve">, and feature importance analysis identified the </w:t>
+      </w:r>
+      <w:proofErr w:type="gramStart"/>
+      <w:r>
+        <w:rPr>
+          <w:rFonts w:ascii="Times New Roman" w:hAnsi="Times New Roman" w:cs="Times New Roman"/>
+          <w:sz w:val="24"/>
+          <w:szCs w:val="24"/>
+        </w:rPr>
+        <w:t xml:space="preserve">most </w:t>
+      </w:r>
+      <w:r>
+        <w:rPr>
+          <w:rFonts w:ascii="Times New Roman" w:hAnsi="Times New Roman" w:cs="Times New Roman"/>
+          <w:sz w:val="24"/>
+          <w:szCs w:val="24"/>
+        </w:rPr>
+        <w:t xml:space="preserve"> </w:t>
+      </w:r>
+      <w:r>
+        <w:rPr>
+          <w:rFonts w:ascii="Times New Roman" w:hAnsi="Times New Roman" w:cs="Times New Roman"/>
+          <w:sz w:val="24"/>
+          <w:szCs w:val="24"/>
+        </w:rPr>
+        <w:t>influential</w:t>
+      </w:r>
+      <w:proofErr w:type="gramEnd"/>
+      <w:r>
+        <w:rPr>
+          <w:rFonts w:ascii="Times New Roman" w:hAnsi="Times New Roman" w:cs="Times New Roman"/>
+          <w:sz w:val="24"/>
+          <w:szCs w:val="24"/>
+        </w:rPr>
+        <w:t xml:space="preserve"> variables for prediction. The completed work provides a solid foundation for the next phase, which will focus on feature selection, model comparison, Explainable AI (SHAP), model optimization, and final evaluation to develop an accurate and interpretable student dropout prediction system.</w:t>
       </w:r>
     </w:p>
     <w:p>
@@ -10110,63 +10784,1158 @@
     </w:p>
     <w:p>
       <w:pPr>
-        <w:rPr>
-          <w:rFonts w:ascii="Times New Roman" w:hAnsi="Times New Roman" w:cs="Times New Roman"/>
+        <w:pStyle w:val="NormalWeb"/>
+        <w:spacing w:before="0" w:beforeAutospacing="0" w:after="0" w:afterAutospacing="0"/>
+        <w:rPr>
           <w:i/>
           <w:iCs/>
-          <w:sz w:val="18"/>
-          <w:szCs w:val="18"/>
-        </w:rPr>
-      </w:pPr>
-      <w:r>
-        <w:rPr>
-          <w:rFonts w:ascii="Times New Roman" w:hAnsi="Times New Roman" w:cs="Times New Roman"/>
+        </w:rPr>
+      </w:pPr>
+      <w:r>
+        <w:rPr>
+          <w:b/>
+          <w:bCs/>
+          <w:color w:val="000000"/>
+        </w:rPr>
+        <w:t>[1</w:t>
+      </w:r>
+      <w:proofErr w:type="gramStart"/>
+      <w:r>
+        <w:rPr>
+          <w:b/>
+          <w:bCs/>
+          <w:color w:val="000000"/>
+        </w:rPr>
+        <w:t>]</w:t>
+      </w:r>
+      <w:r>
+        <w:rPr>
           <w:i/>
           <w:iCs/>
-          <w:sz w:val="18"/>
-          <w:szCs w:val="18"/>
-        </w:rPr>
-        <w:t>[</w:t>
-      </w:r>
-      <w:r>
-        <w:rPr>
-          <w:rFonts w:ascii="Times New Roman" w:hAnsi="Times New Roman" w:cs="Times New Roman"/>
+          <w:color w:val="000000"/>
+        </w:rPr>
+        <w:t xml:space="preserve"> </w:t>
+      </w:r>
+      <w:r>
+        <w:rPr>
           <w:i/>
           <w:iCs/>
-          <w:sz w:val="18"/>
-          <w:szCs w:val="18"/>
-        </w:rPr>
-        <w:t>List</w:t>
-      </w:r>
-      <w:r>
-        <w:rPr>
-          <w:rFonts w:ascii="Times New Roman" w:hAnsi="Times New Roman" w:cs="Times New Roman"/>
+          <w:color w:val="000000"/>
+        </w:rPr>
+        <w:t xml:space="preserve"> I.</w:t>
+      </w:r>
+      <w:proofErr w:type="gramEnd"/>
+      <w:r>
+        <w:rPr>
           <w:i/>
           <w:iCs/>
-          <w:sz w:val="18"/>
-          <w:szCs w:val="18"/>
-        </w:rPr>
-        <w:t xml:space="preserve"> your references here</w:t>
-      </w:r>
-      <w:r>
-        <w:rPr>
-          <w:rFonts w:ascii="Times New Roman" w:hAnsi="Times New Roman" w:cs="Times New Roman"/>
+          <w:color w:val="000000"/>
+        </w:rPr>
+        <w:t xml:space="preserve"> Y. Umar, K. I. Musa, and M. Tella, "Long Short-Term Memory (LSTM) </w:t>
+      </w:r>
+      <w:proofErr w:type="gramStart"/>
+      <w:r>
+        <w:rPr>
           <w:i/>
           <w:iCs/>
-          <w:sz w:val="18"/>
-          <w:szCs w:val="18"/>
-        </w:rPr>
-        <w:t xml:space="preserve"> using IEEE format</w:t>
-      </w:r>
-      <w:r>
-        <w:rPr>
-          <w:rFonts w:ascii="Times New Roman" w:hAnsi="Times New Roman" w:cs="Times New Roman"/>
+          <w:color w:val="000000"/>
+        </w:rPr>
+        <w:t>based  model</w:t>
+      </w:r>
+      <w:proofErr w:type="gramEnd"/>
+      <w:r>
+        <w:rPr>
           <w:i/>
           <w:iCs/>
-          <w:sz w:val="18"/>
-          <w:szCs w:val="18"/>
-        </w:rPr>
-        <w:t xml:space="preserve">] </w:t>
+          <w:color w:val="000000"/>
+        </w:rPr>
+        <w:t xml:space="preserve"> for forecasting of students' dropout," International Journal of Scientific Research in Multidisciplinary Studies, vol. 11, no. 7, pp. 124–135, Jul. 2025. </w:t>
+      </w:r>
+    </w:p>
+    <w:p>
+      <w:pPr>
+        <w:pStyle w:val="NormalWeb"/>
+        <w:spacing w:before="0" w:beforeAutospacing="0" w:after="0" w:afterAutospacing="0"/>
+        <w:rPr>
+          <w:i/>
+          <w:iCs/>
+        </w:rPr>
+      </w:pPr>
+      <w:r>
+        <w:rPr>
+          <w:b/>
+          <w:bCs/>
+          <w:color w:val="000000"/>
+        </w:rPr>
+        <w:t>[2</w:t>
+      </w:r>
+      <w:proofErr w:type="gramStart"/>
+      <w:r>
+        <w:rPr>
+          <w:b/>
+          <w:bCs/>
+          <w:color w:val="000000"/>
+        </w:rPr>
+        <w:t>]</w:t>
+      </w:r>
+      <w:r>
+        <w:rPr>
+          <w:i/>
+          <w:iCs/>
+          <w:color w:val="000000"/>
+        </w:rPr>
+        <w:t>  J.</w:t>
+      </w:r>
+      <w:proofErr w:type="gramEnd"/>
+      <w:r>
+        <w:rPr>
+          <w:i/>
+          <w:iCs/>
+          <w:color w:val="000000"/>
+        </w:rPr>
+        <w:t xml:space="preserve"> Berens, K. Schneider, S. Görtz, S. Oster, and J. Burghoff, "Early detection of students at risk—predicting student dropouts using administrative data and machine learning applications," Research in Higher Education, vol. 60, no. 6, pp. 850–872, 2019. </w:t>
+      </w:r>
+    </w:p>
+    <w:p>
+      <w:pPr>
+        <w:pStyle w:val="NormalWeb"/>
+        <w:spacing w:before="0" w:beforeAutospacing="0" w:after="0" w:afterAutospacing="0"/>
+        <w:rPr>
+          <w:i/>
+          <w:iCs/>
+        </w:rPr>
+      </w:pPr>
+      <w:r>
+        <w:rPr>
+          <w:b/>
+          <w:bCs/>
+          <w:color w:val="000000"/>
+        </w:rPr>
+        <w:t>[3</w:t>
+      </w:r>
+      <w:proofErr w:type="gramStart"/>
+      <w:r>
+        <w:rPr>
+          <w:b/>
+          <w:bCs/>
+          <w:color w:val="000000"/>
+        </w:rPr>
+        <w:t>]</w:t>
+      </w:r>
+      <w:r>
+        <w:rPr>
+          <w:b/>
+          <w:bCs/>
+          <w:i/>
+          <w:iCs/>
+          <w:color w:val="000000"/>
+        </w:rPr>
+        <w:t xml:space="preserve"> </w:t>
+      </w:r>
+      <w:r>
+        <w:rPr>
+          <w:i/>
+          <w:iCs/>
+          <w:color w:val="000000"/>
+        </w:rPr>
+        <w:t> A.</w:t>
+      </w:r>
+      <w:proofErr w:type="gramEnd"/>
+      <w:r>
+        <w:rPr>
+          <w:i/>
+          <w:iCs/>
+          <w:color w:val="000000"/>
+        </w:rPr>
+        <w:t xml:space="preserve"> </w:t>
+      </w:r>
+      <w:proofErr w:type="spellStart"/>
+      <w:r>
+        <w:rPr>
+          <w:i/>
+          <w:iCs/>
+          <w:color w:val="000000"/>
+        </w:rPr>
+        <w:t>Namoun</w:t>
+      </w:r>
+      <w:proofErr w:type="spellEnd"/>
+      <w:r>
+        <w:rPr>
+          <w:i/>
+          <w:iCs/>
+          <w:color w:val="000000"/>
+        </w:rPr>
+        <w:t xml:space="preserve"> and A. </w:t>
+      </w:r>
+      <w:proofErr w:type="spellStart"/>
+      <w:r>
+        <w:rPr>
+          <w:i/>
+          <w:iCs/>
+          <w:color w:val="000000"/>
+        </w:rPr>
+        <w:t>Alshanqiti</w:t>
+      </w:r>
+      <w:proofErr w:type="spellEnd"/>
+      <w:r>
+        <w:rPr>
+          <w:i/>
+          <w:iCs/>
+          <w:color w:val="000000"/>
+        </w:rPr>
+        <w:t>, "Predicting student performance using data mining and learning analytics techniques: A systematic review," Applied Sciences, vol. 11, no. 1, art. no. 237, 2021. </w:t>
+      </w:r>
+    </w:p>
+    <w:p>
+      <w:pPr>
+        <w:pStyle w:val="NormalWeb"/>
+        <w:spacing w:before="0" w:beforeAutospacing="0" w:after="0" w:afterAutospacing="0"/>
+        <w:rPr>
+          <w:i/>
+          <w:iCs/>
+        </w:rPr>
+      </w:pPr>
+      <w:r>
+        <w:rPr>
+          <w:b/>
+          <w:bCs/>
+          <w:color w:val="000000"/>
+        </w:rPr>
+        <w:t>[4</w:t>
+      </w:r>
+      <w:proofErr w:type="gramStart"/>
+      <w:r>
+        <w:rPr>
+          <w:b/>
+          <w:bCs/>
+          <w:color w:val="000000"/>
+        </w:rPr>
+        <w:t>]</w:t>
+      </w:r>
+      <w:r>
+        <w:rPr>
+          <w:b/>
+          <w:bCs/>
+          <w:i/>
+          <w:iCs/>
+          <w:color w:val="000000"/>
+        </w:rPr>
+        <w:t xml:space="preserve"> </w:t>
+      </w:r>
+      <w:r>
+        <w:rPr>
+          <w:i/>
+          <w:iCs/>
+          <w:color w:val="000000"/>
+        </w:rPr>
+        <w:t> N.</w:t>
+      </w:r>
+      <w:proofErr w:type="gramEnd"/>
+      <w:r>
+        <w:rPr>
+          <w:i/>
+          <w:iCs/>
+          <w:color w:val="000000"/>
+        </w:rPr>
+        <w:t xml:space="preserve"> Mduma, "Data balancing techniques for predicting student dropout using machine learning," Data, vol. 8, no. 3, art. no. 49, 2023. </w:t>
+      </w:r>
+    </w:p>
+    <w:p>
+      <w:pPr>
+        <w:pStyle w:val="NormalWeb"/>
+        <w:spacing w:before="0" w:beforeAutospacing="0" w:after="0" w:afterAutospacing="0"/>
+        <w:rPr>
+          <w:i/>
+          <w:iCs/>
+        </w:rPr>
+      </w:pPr>
+      <w:r>
+        <w:rPr>
+          <w:b/>
+          <w:bCs/>
+          <w:color w:val="000000"/>
+        </w:rPr>
+        <w:t>[5</w:t>
+      </w:r>
+      <w:proofErr w:type="gramStart"/>
+      <w:r>
+        <w:rPr>
+          <w:b/>
+          <w:bCs/>
+          <w:color w:val="000000"/>
+        </w:rPr>
+        <w:t>]</w:t>
+      </w:r>
+      <w:r>
+        <w:rPr>
+          <w:b/>
+          <w:bCs/>
+          <w:i/>
+          <w:iCs/>
+          <w:color w:val="000000"/>
+        </w:rPr>
+        <w:t xml:space="preserve"> </w:t>
+      </w:r>
+      <w:r>
+        <w:rPr>
+          <w:i/>
+          <w:iCs/>
+          <w:color w:val="000000"/>
+        </w:rPr>
+        <w:t> M.</w:t>
+      </w:r>
+      <w:proofErr w:type="gramEnd"/>
+      <w:r>
+        <w:rPr>
+          <w:i/>
+          <w:iCs/>
+          <w:color w:val="000000"/>
+        </w:rPr>
+        <w:t xml:space="preserve"> Nagy and R. </w:t>
+      </w:r>
+      <w:proofErr w:type="spellStart"/>
+      <w:r>
+        <w:rPr>
+          <w:i/>
+          <w:iCs/>
+          <w:color w:val="000000"/>
+        </w:rPr>
+        <w:t>Molontay</w:t>
+      </w:r>
+      <w:proofErr w:type="spellEnd"/>
+      <w:r>
+        <w:rPr>
+          <w:i/>
+          <w:iCs/>
+          <w:color w:val="000000"/>
+        </w:rPr>
+        <w:t>, "Interpretable dropout prediction: Towards XAI-based personalized intervention," International Journal of Artificial Intelligence in Education, vol. 34, no. 2, pp. 274–300, 2024. </w:t>
+      </w:r>
+    </w:p>
+    <w:p>
+      <w:pPr>
+        <w:pStyle w:val="NormalWeb"/>
+        <w:spacing w:before="0" w:beforeAutospacing="0" w:after="0" w:afterAutospacing="0"/>
+        <w:rPr>
+          <w:i/>
+          <w:iCs/>
+        </w:rPr>
+      </w:pPr>
+      <w:r>
+        <w:rPr>
+          <w:b/>
+          <w:bCs/>
+          <w:color w:val="000000"/>
+        </w:rPr>
+        <w:t>[6</w:t>
+      </w:r>
+      <w:proofErr w:type="gramStart"/>
+      <w:r>
+        <w:rPr>
+          <w:b/>
+          <w:bCs/>
+          <w:color w:val="000000"/>
+        </w:rPr>
+        <w:t>]</w:t>
+      </w:r>
+      <w:r>
+        <w:rPr>
+          <w:b/>
+          <w:bCs/>
+          <w:i/>
+          <w:iCs/>
+          <w:color w:val="000000"/>
+        </w:rPr>
+        <w:t xml:space="preserve"> </w:t>
+      </w:r>
+      <w:r>
+        <w:rPr>
+          <w:i/>
+          <w:iCs/>
+          <w:color w:val="000000"/>
+        </w:rPr>
+        <w:t> L.</w:t>
+      </w:r>
+      <w:proofErr w:type="gramEnd"/>
+      <w:r>
+        <w:rPr>
+          <w:i/>
+          <w:iCs/>
+          <w:color w:val="000000"/>
+        </w:rPr>
+        <w:t xml:space="preserve"> C. Nnadi, Y. </w:t>
+      </w:r>
+      <w:proofErr w:type="spellStart"/>
+      <w:r>
+        <w:rPr>
+          <w:i/>
+          <w:iCs/>
+          <w:color w:val="000000"/>
+        </w:rPr>
+        <w:t>Watanobe</w:t>
+      </w:r>
+      <w:proofErr w:type="spellEnd"/>
+      <w:r>
+        <w:rPr>
+          <w:i/>
+          <w:iCs/>
+          <w:color w:val="000000"/>
+        </w:rPr>
+        <w:t>, M. M. Rahman, and A. M. John-Otumu, "Prediction of students' adaptability using explainable AI in educational machine learning models," Applied Sciences, vol. 14, no. 12, art. no. 5141, 2024. </w:t>
+      </w:r>
+    </w:p>
+    <w:p>
+      <w:pPr>
+        <w:pStyle w:val="NormalWeb"/>
+        <w:spacing w:before="0" w:beforeAutospacing="0" w:after="0" w:afterAutospacing="0"/>
+        <w:rPr>
+          <w:i/>
+          <w:iCs/>
+        </w:rPr>
+      </w:pPr>
+      <w:r>
+        <w:rPr>
+          <w:b/>
+          <w:bCs/>
+          <w:color w:val="000000"/>
+        </w:rPr>
+        <w:t>[7</w:t>
+      </w:r>
+      <w:proofErr w:type="gramStart"/>
+      <w:r>
+        <w:rPr>
+          <w:b/>
+          <w:bCs/>
+          <w:color w:val="000000"/>
+        </w:rPr>
+        <w:t>]</w:t>
+      </w:r>
+      <w:r>
+        <w:rPr>
+          <w:b/>
+          <w:bCs/>
+          <w:i/>
+          <w:iCs/>
+          <w:color w:val="000000"/>
+        </w:rPr>
+        <w:t xml:space="preserve"> </w:t>
+      </w:r>
+      <w:r>
+        <w:rPr>
+          <w:i/>
+          <w:iCs/>
+          <w:color w:val="000000"/>
+        </w:rPr>
+        <w:t> M.</w:t>
+      </w:r>
+      <w:proofErr w:type="gramEnd"/>
+      <w:r>
+        <w:rPr>
+          <w:i/>
+          <w:iCs/>
+          <w:color w:val="000000"/>
+        </w:rPr>
+        <w:t xml:space="preserve"> </w:t>
+      </w:r>
+      <w:proofErr w:type="spellStart"/>
+      <w:r>
+        <w:rPr>
+          <w:i/>
+          <w:iCs/>
+          <w:color w:val="000000"/>
+        </w:rPr>
+        <w:t>Vaarma</w:t>
+      </w:r>
+      <w:proofErr w:type="spellEnd"/>
+      <w:r>
+        <w:rPr>
+          <w:i/>
+          <w:iCs/>
+          <w:color w:val="000000"/>
+        </w:rPr>
+        <w:t xml:space="preserve"> and H. Li, "Predicting student dropout using Moodle activity trends," Technology in Society, vol. 76, art. no. 102474, 2024. </w:t>
+      </w:r>
+    </w:p>
+    <w:p>
+      <w:pPr>
+        <w:pStyle w:val="NormalWeb"/>
+        <w:spacing w:before="0" w:beforeAutospacing="0" w:after="0" w:afterAutospacing="0"/>
+        <w:rPr>
+          <w:i/>
+          <w:iCs/>
+        </w:rPr>
+      </w:pPr>
+      <w:r>
+        <w:rPr>
+          <w:b/>
+          <w:bCs/>
+          <w:color w:val="000000"/>
+        </w:rPr>
+        <w:t>[8</w:t>
+      </w:r>
+      <w:proofErr w:type="gramStart"/>
+      <w:r>
+        <w:rPr>
+          <w:b/>
+          <w:bCs/>
+          <w:color w:val="000000"/>
+        </w:rPr>
+        <w:t>]</w:t>
+      </w:r>
+      <w:r>
+        <w:rPr>
+          <w:i/>
+          <w:iCs/>
+          <w:color w:val="000000"/>
+        </w:rPr>
+        <w:t>  C.</w:t>
+      </w:r>
+      <w:proofErr w:type="gramEnd"/>
+      <w:r>
+        <w:rPr>
+          <w:i/>
+          <w:iCs/>
+          <w:color w:val="000000"/>
+        </w:rPr>
+        <w:t xml:space="preserve"> Kemper et al., "Early prediction of student dropout based on machine learning," in Proceedings of the International Conference on Educational Data Mining (EDM), 2020, pp. 112–120. </w:t>
+      </w:r>
+    </w:p>
+    <w:p>
+      <w:pPr>
+        <w:pStyle w:val="NormalWeb"/>
+        <w:spacing w:before="0" w:beforeAutospacing="0" w:after="0" w:afterAutospacing="0"/>
+        <w:rPr>
+          <w:i/>
+          <w:iCs/>
+        </w:rPr>
+      </w:pPr>
+      <w:r>
+        <w:rPr>
+          <w:b/>
+          <w:bCs/>
+          <w:color w:val="000000"/>
+        </w:rPr>
+        <w:t>[9</w:t>
+      </w:r>
+      <w:proofErr w:type="gramStart"/>
+      <w:r>
+        <w:rPr>
+          <w:b/>
+          <w:bCs/>
+          <w:color w:val="000000"/>
+        </w:rPr>
+        <w:t>]</w:t>
+      </w:r>
+      <w:r>
+        <w:rPr>
+          <w:i/>
+          <w:iCs/>
+          <w:color w:val="000000"/>
+        </w:rPr>
+        <w:t>  S.</w:t>
+      </w:r>
+      <w:proofErr w:type="gramEnd"/>
+      <w:r>
+        <w:rPr>
+          <w:i/>
+          <w:iCs/>
+          <w:color w:val="000000"/>
+        </w:rPr>
+        <w:t xml:space="preserve"> Kim et al., "Student dropout prediction using deep learning techniques," IEEE Access, vol. 10, pp. 45120–45131, 2022. </w:t>
+      </w:r>
+    </w:p>
+    <w:p>
+      <w:pPr>
+        <w:pStyle w:val="NormalWeb"/>
+        <w:spacing w:before="0" w:beforeAutospacing="0" w:after="0" w:afterAutospacing="0"/>
+        <w:rPr>
+          <w:i/>
+          <w:iCs/>
+        </w:rPr>
+      </w:pPr>
+      <w:r>
+        <w:rPr>
+          <w:b/>
+          <w:bCs/>
+          <w:color w:val="000000"/>
+        </w:rPr>
+        <w:t>[10</w:t>
+      </w:r>
+      <w:proofErr w:type="gramStart"/>
+      <w:r>
+        <w:rPr>
+          <w:b/>
+          <w:bCs/>
+          <w:color w:val="000000"/>
+        </w:rPr>
+        <w:t>]</w:t>
+      </w:r>
+      <w:r>
+        <w:rPr>
+          <w:i/>
+          <w:iCs/>
+          <w:color w:val="000000"/>
+        </w:rPr>
+        <w:t>  A.</w:t>
+      </w:r>
+      <w:proofErr w:type="gramEnd"/>
+      <w:r>
+        <w:rPr>
+          <w:i/>
+          <w:iCs/>
+          <w:color w:val="000000"/>
+        </w:rPr>
+        <w:t xml:space="preserve"> Sharma and P. Kumar, "Interpretable machine learning for student dropout risk assessment," IEEE Transactions on Learning Technologies, vol. 16, no. 4, pp. 510–522, 2023. </w:t>
+      </w:r>
+    </w:p>
+    <w:p>
+      <w:pPr>
+        <w:pStyle w:val="NormalWeb"/>
+        <w:spacing w:before="0" w:beforeAutospacing="0" w:after="0" w:afterAutospacing="0"/>
+        <w:rPr>
+          <w:i/>
+          <w:iCs/>
+        </w:rPr>
+      </w:pPr>
+      <w:r>
+        <w:rPr>
+          <w:b/>
+          <w:bCs/>
+          <w:color w:val="000000"/>
+        </w:rPr>
+        <w:t>[11</w:t>
+      </w:r>
+      <w:proofErr w:type="gramStart"/>
+      <w:r>
+        <w:rPr>
+          <w:b/>
+          <w:bCs/>
+          <w:color w:val="000000"/>
+        </w:rPr>
+        <w:t>]</w:t>
+      </w:r>
+      <w:r>
+        <w:rPr>
+          <w:i/>
+          <w:iCs/>
+          <w:color w:val="000000"/>
+        </w:rPr>
+        <w:t xml:space="preserve"> </w:t>
+      </w:r>
+      <w:r>
+        <w:rPr>
+          <w:i/>
+          <w:iCs/>
+          <w:color w:val="000000"/>
+        </w:rPr>
+        <w:t xml:space="preserve"> </w:t>
+      </w:r>
+      <w:r>
+        <w:rPr>
+          <w:i/>
+          <w:iCs/>
+          <w:color w:val="000000"/>
+        </w:rPr>
+        <w:t>S.C.</w:t>
+      </w:r>
+      <w:proofErr w:type="gramEnd"/>
+      <w:r>
+        <w:rPr>
+          <w:i/>
+          <w:iCs/>
+          <w:color w:val="000000"/>
+        </w:rPr>
+        <w:t xml:space="preserve"> Matz, C.S. </w:t>
+      </w:r>
+      <w:proofErr w:type="spellStart"/>
+      <w:r>
+        <w:rPr>
+          <w:i/>
+          <w:iCs/>
+          <w:color w:val="000000"/>
+        </w:rPr>
+        <w:t>Bukow</w:t>
+      </w:r>
+      <w:proofErr w:type="spellEnd"/>
+      <w:r>
+        <w:rPr>
+          <w:i/>
+          <w:iCs/>
+          <w:color w:val="000000"/>
+        </w:rPr>
+        <w:t xml:space="preserve">, H. Peters, C. Deacons, A. Dinu, C. </w:t>
+      </w:r>
+      <w:proofErr w:type="spellStart"/>
+      <w:r>
+        <w:rPr>
+          <w:i/>
+          <w:iCs/>
+          <w:color w:val="000000"/>
+        </w:rPr>
+        <w:t>Stachl</w:t>
+      </w:r>
+      <w:proofErr w:type="spellEnd"/>
+      <w:r>
+        <w:rPr>
+          <w:i/>
+          <w:iCs/>
+          <w:color w:val="000000"/>
+        </w:rPr>
+        <w:t xml:space="preserve">, </w:t>
+      </w:r>
+      <w:proofErr w:type="gramStart"/>
+      <w:r>
+        <w:rPr>
+          <w:i/>
+          <w:iCs/>
+          <w:color w:val="000000"/>
+        </w:rPr>
+        <w:t>Using</w:t>
+      </w:r>
+      <w:proofErr w:type="gramEnd"/>
+      <w:r>
+        <w:rPr>
+          <w:i/>
+          <w:iCs/>
+          <w:color w:val="000000"/>
+        </w:rPr>
+        <w:t xml:space="preserve"> machine learning to predict student retention from socio-demographic characteristics and app-based engagement metrics, Sci. Rep. 13 (2023) 5705</w:t>
+      </w:r>
+    </w:p>
+    <w:p>
+      <w:pPr>
+        <w:pStyle w:val="NormalWeb"/>
+        <w:spacing w:before="0" w:beforeAutospacing="0" w:after="0" w:afterAutospacing="0"/>
+        <w:rPr>
+          <w:i/>
+          <w:iCs/>
+        </w:rPr>
+      </w:pPr>
+      <w:r>
+        <w:rPr>
+          <w:b/>
+          <w:bCs/>
+          <w:color w:val="000000"/>
+        </w:rPr>
+        <w:t>[12</w:t>
+      </w:r>
+      <w:proofErr w:type="gramStart"/>
+      <w:r>
+        <w:rPr>
+          <w:b/>
+          <w:bCs/>
+          <w:color w:val="000000"/>
+        </w:rPr>
+        <w:t>]</w:t>
+      </w:r>
+      <w:r>
+        <w:rPr>
+          <w:b/>
+          <w:bCs/>
+          <w:color w:val="000000"/>
+        </w:rPr>
+        <w:t xml:space="preserve"> </w:t>
+      </w:r>
+      <w:r>
+        <w:rPr>
+          <w:i/>
+          <w:iCs/>
+          <w:color w:val="000000"/>
+        </w:rPr>
+        <w:t xml:space="preserve"> M.</w:t>
+      </w:r>
+      <w:proofErr w:type="gramEnd"/>
+      <w:r>
+        <w:rPr>
+          <w:i/>
+          <w:iCs/>
+          <w:color w:val="000000"/>
+        </w:rPr>
+        <w:t xml:space="preserve"> Nagy, R. </w:t>
+      </w:r>
+      <w:proofErr w:type="spellStart"/>
+      <w:r>
+        <w:rPr>
+          <w:i/>
+          <w:iCs/>
+          <w:color w:val="000000"/>
+        </w:rPr>
+        <w:t>Molontay</w:t>
+      </w:r>
+      <w:proofErr w:type="spellEnd"/>
+      <w:r>
+        <w:rPr>
+          <w:i/>
+          <w:iCs/>
+          <w:color w:val="000000"/>
+        </w:rPr>
+        <w:t xml:space="preserve">, Interpretable dropout prediction: towards XAI-based personalized intervention, Int. J. </w:t>
+      </w:r>
+      <w:proofErr w:type="spellStart"/>
+      <w:r>
+        <w:rPr>
+          <w:i/>
+          <w:iCs/>
+          <w:color w:val="000000"/>
+        </w:rPr>
+        <w:t>Artif</w:t>
+      </w:r>
+      <w:proofErr w:type="spellEnd"/>
+      <w:r>
+        <w:rPr>
+          <w:i/>
+          <w:iCs/>
+          <w:color w:val="000000"/>
+        </w:rPr>
+        <w:t>. Intell. Educ. (2023) </w:t>
+      </w:r>
+    </w:p>
+    <w:p>
+      <w:pPr>
+        <w:pStyle w:val="NormalWeb"/>
+        <w:spacing w:before="0" w:beforeAutospacing="0" w:after="0" w:afterAutospacing="0"/>
+        <w:rPr>
+          <w:i/>
+          <w:iCs/>
+        </w:rPr>
+      </w:pPr>
+      <w:r>
+        <w:rPr>
+          <w:b/>
+          <w:bCs/>
+          <w:color w:val="000000"/>
+        </w:rPr>
+        <w:t>[13</w:t>
+      </w:r>
+      <w:proofErr w:type="gramStart"/>
+      <w:r>
+        <w:rPr>
+          <w:b/>
+          <w:bCs/>
+          <w:color w:val="000000"/>
+        </w:rPr>
+        <w:t>]</w:t>
+      </w:r>
+      <w:r>
+        <w:rPr>
+          <w:i/>
+          <w:iCs/>
+          <w:color w:val="000000"/>
+        </w:rPr>
+        <w:t xml:space="preserve"> </w:t>
+      </w:r>
+      <w:r>
+        <w:rPr>
+          <w:i/>
+          <w:iCs/>
+          <w:color w:val="000000"/>
+        </w:rPr>
+        <w:t xml:space="preserve"> </w:t>
+      </w:r>
+      <w:r>
+        <w:rPr>
+          <w:i/>
+          <w:iCs/>
+          <w:color w:val="000000"/>
+        </w:rPr>
+        <w:t>Z.</w:t>
+      </w:r>
+      <w:proofErr w:type="gramEnd"/>
+      <w:r>
+        <w:rPr>
+          <w:i/>
+          <w:iCs/>
+          <w:color w:val="000000"/>
+        </w:rPr>
+        <w:t xml:space="preserve"> Song, S.-H. Sung, D.-M. Park, B.-K. Park, All-year dropout prediction modeling and analysis for university students, Appl. Sci. 13 (2) (2023) </w:t>
+      </w:r>
+    </w:p>
+    <w:p>
+      <w:pPr>
+        <w:pStyle w:val="NormalWeb"/>
+        <w:spacing w:before="0" w:beforeAutospacing="0" w:after="0" w:afterAutospacing="0"/>
+        <w:rPr>
+          <w:i/>
+          <w:iCs/>
+        </w:rPr>
+      </w:pPr>
+      <w:r>
+        <w:rPr>
+          <w:b/>
+          <w:bCs/>
+          <w:color w:val="000000"/>
+        </w:rPr>
+        <w:t>[14</w:t>
+      </w:r>
+      <w:proofErr w:type="gramStart"/>
+      <w:r>
+        <w:rPr>
+          <w:b/>
+          <w:bCs/>
+          <w:color w:val="000000"/>
+        </w:rPr>
+        <w:t>]</w:t>
+      </w:r>
+      <w:r>
+        <w:rPr>
+          <w:i/>
+          <w:iCs/>
+          <w:color w:val="000000"/>
+        </w:rPr>
+        <w:t xml:space="preserve"> </w:t>
+      </w:r>
+      <w:r>
+        <w:rPr>
+          <w:i/>
+          <w:iCs/>
+          <w:color w:val="000000"/>
+        </w:rPr>
+        <w:t xml:space="preserve"> </w:t>
+      </w:r>
+      <w:r>
+        <w:rPr>
+          <w:i/>
+          <w:iCs/>
+          <w:color w:val="000000"/>
+        </w:rPr>
+        <w:t>R.</w:t>
+      </w:r>
+      <w:proofErr w:type="gramEnd"/>
+      <w:r>
+        <w:rPr>
+          <w:i/>
+          <w:iCs/>
+          <w:color w:val="000000"/>
+        </w:rPr>
+        <w:t xml:space="preserve"> Chen, S.L. </w:t>
+      </w:r>
+      <w:proofErr w:type="spellStart"/>
+      <w:r>
+        <w:rPr>
+          <w:i/>
+          <w:iCs/>
+          <w:color w:val="000000"/>
+        </w:rPr>
+        <w:t>DesJardins</w:t>
+      </w:r>
+      <w:proofErr w:type="spellEnd"/>
+      <w:r>
+        <w:rPr>
+          <w:i/>
+          <w:iCs/>
+          <w:color w:val="000000"/>
+        </w:rPr>
+        <w:t>, Investigating the impact of financial aid on student dropout risks: racial and ethnic differences, J. High Educ. 81 (2) (2010) </w:t>
+      </w:r>
+    </w:p>
+    <w:p>
+      <w:pPr>
+        <w:pStyle w:val="NormalWeb"/>
+        <w:spacing w:before="0" w:beforeAutospacing="0" w:after="0" w:afterAutospacing="0"/>
+        <w:rPr>
+          <w:i/>
+          <w:iCs/>
+        </w:rPr>
+      </w:pPr>
+      <w:r>
+        <w:rPr>
+          <w:b/>
+          <w:bCs/>
+          <w:color w:val="000000"/>
+        </w:rPr>
+        <w:t>[15</w:t>
+      </w:r>
+      <w:proofErr w:type="gramStart"/>
+      <w:r>
+        <w:rPr>
+          <w:b/>
+          <w:bCs/>
+          <w:color w:val="000000"/>
+        </w:rPr>
+        <w:t>]</w:t>
+      </w:r>
+      <w:r>
+        <w:rPr>
+          <w:b/>
+          <w:bCs/>
+          <w:color w:val="000000"/>
+        </w:rPr>
+        <w:t xml:space="preserve"> </w:t>
+      </w:r>
+      <w:r>
+        <w:rPr>
+          <w:i/>
+          <w:iCs/>
+          <w:color w:val="000000"/>
+        </w:rPr>
+        <w:t xml:space="preserve"> S.F.</w:t>
+      </w:r>
+      <w:proofErr w:type="gramEnd"/>
+      <w:r>
+        <w:rPr>
+          <w:i/>
+          <w:iCs/>
+          <w:color w:val="000000"/>
+        </w:rPr>
+        <w:t xml:space="preserve"> Porchea, J. Allen, S. Robbins, R.P. Phelps, Predictors of long-term enrollment and degree outcomes for community college students: integrating academic, psychosocial, socio-demographic, and situational factors, J. High Educ. 81 (6) (2010) </w:t>
+      </w:r>
+    </w:p>
+    <w:p>
+      <w:pPr>
+        <w:pStyle w:val="NormalWeb"/>
+        <w:spacing w:before="0" w:beforeAutospacing="0" w:after="0" w:afterAutospacing="0"/>
+        <w:rPr>
+          <w:i/>
+          <w:iCs/>
+        </w:rPr>
+      </w:pPr>
+      <w:r>
+        <w:rPr>
+          <w:b/>
+          <w:bCs/>
+          <w:color w:val="000000"/>
+        </w:rPr>
+        <w:t>[16</w:t>
+      </w:r>
+      <w:proofErr w:type="gramStart"/>
+      <w:r>
+        <w:rPr>
+          <w:b/>
+          <w:bCs/>
+          <w:color w:val="000000"/>
+        </w:rPr>
+        <w:t>]</w:t>
+      </w:r>
+      <w:r>
+        <w:rPr>
+          <w:b/>
+          <w:bCs/>
+          <w:color w:val="000000"/>
+        </w:rPr>
+        <w:t xml:space="preserve"> </w:t>
+      </w:r>
+      <w:r>
+        <w:rPr>
+          <w:i/>
+          <w:iCs/>
+          <w:color w:val="000000"/>
+        </w:rPr>
+        <w:t xml:space="preserve"> T.T.</w:t>
+      </w:r>
+      <w:proofErr w:type="gramEnd"/>
+      <w:r>
+        <w:rPr>
+          <w:i/>
+          <w:iCs/>
+          <w:color w:val="000000"/>
+        </w:rPr>
+        <w:t xml:space="preserve"> </w:t>
+      </w:r>
+      <w:proofErr w:type="spellStart"/>
+      <w:r>
+        <w:rPr>
+          <w:i/>
+          <w:iCs/>
+          <w:color w:val="000000"/>
+        </w:rPr>
+        <w:t>Ishitani</w:t>
+      </w:r>
+      <w:proofErr w:type="spellEnd"/>
+      <w:r>
+        <w:rPr>
+          <w:i/>
+          <w:iCs/>
+          <w:color w:val="000000"/>
+        </w:rPr>
+        <w:t xml:space="preserve">, Studying attrition and degree completion behavior among </w:t>
+      </w:r>
+      <w:proofErr w:type="spellStart"/>
+      <w:r>
+        <w:rPr>
+          <w:i/>
+          <w:iCs/>
+          <w:color w:val="000000"/>
+        </w:rPr>
+        <w:t>firstgeneration</w:t>
+      </w:r>
+      <w:proofErr w:type="spellEnd"/>
+      <w:r>
+        <w:rPr>
+          <w:i/>
+          <w:iCs/>
+          <w:color w:val="000000"/>
+        </w:rPr>
+        <w:t xml:space="preserve"> college students in the United States, J. High Educ. 77 (5) (2006) </w:t>
+      </w:r>
+    </w:p>
+    <w:p>
+      <w:pPr>
+        <w:pStyle w:val="NormalWeb"/>
+        <w:spacing w:before="0" w:beforeAutospacing="0" w:after="0" w:afterAutospacing="0"/>
+        <w:rPr>
+          <w:i/>
+          <w:iCs/>
+        </w:rPr>
+      </w:pPr>
+      <w:r>
+        <w:rPr>
+          <w:b/>
+          <w:bCs/>
+          <w:color w:val="000000"/>
+        </w:rPr>
+        <w:t>[17</w:t>
+      </w:r>
+      <w:proofErr w:type="gramStart"/>
+      <w:r>
+        <w:rPr>
+          <w:b/>
+          <w:bCs/>
+          <w:color w:val="000000"/>
+        </w:rPr>
+        <w:t>]</w:t>
+      </w:r>
+      <w:r>
+        <w:rPr>
+          <w:b/>
+          <w:bCs/>
+          <w:color w:val="000000"/>
+        </w:rPr>
+        <w:t xml:space="preserve"> </w:t>
+      </w:r>
+      <w:r>
+        <w:rPr>
+          <w:i/>
+          <w:iCs/>
+          <w:color w:val="000000"/>
+        </w:rPr>
+        <w:t xml:space="preserve"> S.L.</w:t>
+      </w:r>
+      <w:proofErr w:type="gramEnd"/>
+      <w:r>
+        <w:rPr>
+          <w:i/>
+          <w:iCs/>
+          <w:color w:val="000000"/>
+        </w:rPr>
+        <w:t xml:space="preserve"> </w:t>
+      </w:r>
+      <w:proofErr w:type="spellStart"/>
+      <w:r>
+        <w:rPr>
+          <w:i/>
+          <w:iCs/>
+          <w:color w:val="000000"/>
+        </w:rPr>
+        <w:t>DesJardins</w:t>
+      </w:r>
+      <w:proofErr w:type="spellEnd"/>
+      <w:r>
+        <w:rPr>
+          <w:i/>
+          <w:iCs/>
+          <w:color w:val="000000"/>
+        </w:rPr>
+        <w:t>, D.A. Ahlburg, B.P. McCall, A temporal investigation of factors related to timely degree completion, J. High Educ. 73 (5) (2002) </w:t>
       </w:r>
     </w:p>
     <w:p>
@@ -10179,37 +11948,6 @@
           <w:szCs w:val="28"/>
         </w:rPr>
       </w:pPr>
-      <w:r>
-        <w:rPr>
-          <w:rFonts w:ascii="Times New Roman" w:hAnsi="Times New Roman" w:cs="Times New Roman"/>
-          <w:b/>
-          <w:bCs/>
-          <w:sz w:val="28"/>
-          <w:szCs w:val="28"/>
-        </w:rPr>
-        <w:t>[1]</w:t>
-      </w:r>
-    </w:p>
-    <w:p>
-      <w:pPr>
-        <w:rPr>
-          <w:rFonts w:ascii="Times New Roman" w:hAnsi="Times New Roman" w:cs="Times New Roman"/>
-          <w:b/>
-          <w:bCs/>
-          <w:sz w:val="28"/>
-          <w:szCs w:val="28"/>
-        </w:rPr>
-      </w:pPr>
-      <w:r>
-        <w:rPr>
-          <w:rFonts w:ascii="Times New Roman" w:hAnsi="Times New Roman" w:cs="Times New Roman"/>
-          <w:b/>
-          <w:bCs/>
-          <w:sz w:val="28"/>
-          <w:szCs w:val="28"/>
-        </w:rPr>
-        <w:t>[2]</w:t>
-      </w:r>
     </w:p>
     <w:p>
       <w:pPr>
@@ -10281,7 +12019,7 @@
                     </pic:cNvPicPr>
                   </pic:nvPicPr>
                   <pic:blipFill>
-                    <a:blip r:embed="rId10" cstate="print">
+                    <a:blip r:embed="rId11" cstate="print">
                       <a:extLst>
                         <a:ext uri="{28A0092B-C50C-407E-A947-70E740481C1C}">
                           <a14:useLocalDpi xmlns:a14="http://schemas.microsoft.com/office/drawing/2010/main" val="0"/>
@@ -10334,7 +12072,6 @@
           <w:sz w:val="24"/>
           <w:szCs w:val="24"/>
         </w:rPr>
-        <w:lastRenderedPageBreak/>
         <w:drawing>
           <wp:inline distT="0" distB="0" distL="0" distR="0" wp14:anchorId="3F4523CE" wp14:editId="7DEBF241">
             <wp:extent cx="3974124" cy="3193667"/>
@@ -10353,7 +12090,7 @@
                     </pic:cNvPicPr>
                   </pic:nvPicPr>
                   <pic:blipFill>
-                    <a:blip r:embed="rId11" cstate="print">
+                    <a:blip r:embed="rId12" cstate="print">
                       <a:extLst>
                         <a:ext uri="{28A0092B-C50C-407E-A947-70E740481C1C}">
                           <a14:useLocalDpi xmlns:a14="http://schemas.microsoft.com/office/drawing/2010/main" val="0"/>
@@ -10424,7 +12161,7 @@
                     </pic:cNvPicPr>
                   </pic:nvPicPr>
                   <pic:blipFill>
-                    <a:blip r:embed="rId12" cstate="print">
+                    <a:blip r:embed="rId13" cstate="print">
                       <a:extLst>
                         <a:ext uri="{28A0092B-C50C-407E-A947-70E740481C1C}">
                           <a14:useLocalDpi xmlns:a14="http://schemas.microsoft.com/office/drawing/2010/main" val="0"/>
@@ -10474,7 +12211,7 @@
         </w:rPr>
         <w:t xml:space="preserve">GitHub Repository Link:  </w:t>
       </w:r>
-      <w:hyperlink r:id="rId13" w:history="1">
+      <w:hyperlink r:id="rId14" w:history="1">
         <w:r>
           <w:rPr>
             <w:rStyle w:val="Hyperlink"/>
@@ -11080,12 +12817,12 @@
       </w:pPr>
     </w:p>
     <w:sectPr>
-      <w:headerReference w:type="even" r:id="rId14"/>
-      <w:headerReference w:type="default" r:id="rId15"/>
-      <w:footerReference w:type="even" r:id="rId16"/>
-      <w:footerReference w:type="default" r:id="rId17"/>
-      <w:headerReference w:type="first" r:id="rId18"/>
-      <w:footerReference w:type="first" r:id="rId19"/>
+      <w:headerReference w:type="even" r:id="rId15"/>
+      <w:headerReference w:type="default" r:id="rId16"/>
+      <w:footerReference w:type="even" r:id="rId17"/>
+      <w:footerReference w:type="default" r:id="rId18"/>
+      <w:headerReference w:type="first" r:id="rId19"/>
+      <w:footerReference w:type="first" r:id="rId20"/>
       <w:pgSz w:w="12240" w:h="15840"/>
       <w:pgMar w:top="1440" w:right="1440" w:bottom="1440" w:left="1440" w:header="720" w:footer="432" w:gutter="0"/>
       <w:cols w:space="720"/>

</xml_diff>